<commit_message>
Update resume with portfolio link and regenerate PDF.
Replace the strategy analyst resume source and PDF with the latest DOCX including shreyu311.github.io, GitHub, and LinkedIn links.

Co-authored-by: Cursor <cursoragent@cursor.com>
</commit_message>
<xml_diff>
--- a/resume/Shrey_Resume_Business_Strategy_Analyst.docx
+++ b/resume/Shrey_Resume_Business_Strategy_Analyst.docx
@@ -44,29 +44,31 @@
           <w:sz w:val="19"/>
           <w:szCs w:val="19"/>
         </w:rPr>
-        <w:t>MA</w:t>
-      </w:r>
+        <w:t>MA  •</w:t>
+      </w:r>
+      <w:proofErr w:type="gramEnd"/>
       <w:r>
         <w:rPr>
           <w:sz w:val="19"/>
           <w:szCs w:val="19"/>
         </w:rPr>
-        <w:t xml:space="preserve">  •</w:t>
-      </w:r>
-      <w:proofErr w:type="gramEnd"/>
+        <w:t xml:space="preserve">  857-364-</w:t>
+      </w:r>
+      <w:proofErr w:type="gramStart"/>
       <w:r>
         <w:rPr>
           <w:sz w:val="19"/>
           <w:szCs w:val="19"/>
         </w:rPr>
-        <w:t xml:space="preserve">  </w:t>
-      </w:r>
+        <w:t>1539  •</w:t>
+      </w:r>
+      <w:proofErr w:type="gramEnd"/>
       <w:r>
         <w:rPr>
           <w:sz w:val="19"/>
           <w:szCs w:val="19"/>
         </w:rPr>
-        <w:t>857-364-</w:t>
+        <w:t xml:space="preserve">  </w:t>
       </w:r>
       <w:proofErr w:type="gramStart"/>
       <w:r>
@@ -74,118 +76,9 @@
           <w:sz w:val="19"/>
           <w:szCs w:val="19"/>
         </w:rPr>
-        <w:t>1539</w:t>
-      </w:r>
-      <w:r>
-        <w:rPr>
-          <w:sz w:val="19"/>
-          <w:szCs w:val="19"/>
-        </w:rPr>
-        <w:t xml:space="preserve">  •</w:t>
+        <w:t>shirke.sh@northeastern.edu  •</w:t>
       </w:r>
       <w:proofErr w:type="gramEnd"/>
-      <w:r>
-        <w:rPr>
-          <w:sz w:val="19"/>
-          <w:szCs w:val="19"/>
-        </w:rPr>
-        <w:t xml:space="preserve">  </w:t>
-      </w:r>
-      <w:proofErr w:type="gramStart"/>
-      <w:r>
-        <w:rPr>
-          <w:sz w:val="19"/>
-          <w:szCs w:val="19"/>
-        </w:rPr>
-        <w:t>shirke.sh@northeastern.edu</w:t>
-      </w:r>
-      <w:r>
-        <w:rPr>
-          <w:sz w:val="19"/>
-          <w:szCs w:val="19"/>
-        </w:rPr>
-        <w:t xml:space="preserve">  •</w:t>
-      </w:r>
-      <w:proofErr w:type="gramEnd"/>
-      <w:r>
-        <w:rPr>
-          <w:sz w:val="19"/>
-          <w:szCs w:val="19"/>
-        </w:rPr>
-        <w:t xml:space="preserve">  </w:t>
-      </w:r>
-      <w:r>
-        <w:rPr>
-          <w:sz w:val="19"/>
-          <w:szCs w:val="19"/>
-        </w:rPr>
-        <w:fldChar w:fldCharType="begin"/>
-      </w:r>
-      <w:r>
-        <w:rPr>
-          <w:sz w:val="19"/>
-          <w:szCs w:val="19"/>
-        </w:rPr>
-        <w:instrText>HYPERLINK "https://www.linkedin.com/in/shreyas-shirke-6085481b9/"</w:instrText>
-      </w:r>
-      <w:r>
-        <w:rPr>
-          <w:sz w:val="19"/>
-          <w:szCs w:val="19"/>
-        </w:rPr>
-      </w:r>
-      <w:r>
-        <w:rPr>
-          <w:sz w:val="19"/>
-          <w:szCs w:val="19"/>
-        </w:rPr>
-        <w:fldChar w:fldCharType="separate"/>
-      </w:r>
-      <w:r>
-        <w:rPr>
-          <w:rStyle w:val="Hyperlink"/>
-          <w:sz w:val="19"/>
-          <w:szCs w:val="19"/>
-        </w:rPr>
-        <w:t>Link</w:t>
-      </w:r>
-      <w:r>
-        <w:rPr>
-          <w:rStyle w:val="Hyperlink"/>
-          <w:sz w:val="19"/>
-          <w:szCs w:val="19"/>
-        </w:rPr>
-        <w:t>e</w:t>
-      </w:r>
-      <w:r>
-        <w:rPr>
-          <w:rStyle w:val="Hyperlink"/>
-          <w:sz w:val="19"/>
-          <w:szCs w:val="19"/>
-        </w:rPr>
-        <w:t>dIn</w:t>
-      </w:r>
-      <w:r>
-        <w:rPr>
-          <w:sz w:val="19"/>
-          <w:szCs w:val="19"/>
-        </w:rPr>
-        <w:fldChar w:fldCharType="end"/>
-      </w:r>
-      <w:r>
-        <w:rPr>
-          <w:sz w:val="19"/>
-          <w:szCs w:val="19"/>
-        </w:rPr>
-        <w:t xml:space="preserve">  </w:t>
-      </w:r>
-      <w:r>
-        <w:rPr>
-          <w:sz w:val="19"/>
-          <w:szCs w:val="19"/>
-        </w:rPr>
-        <w:t>•</w:t>
-      </w:r>
       <w:r>
         <w:rPr>
           <w:sz w:val="19"/>
@@ -200,7 +93,63 @@
             <w:sz w:val="19"/>
             <w:szCs w:val="19"/>
           </w:rPr>
-          <w:t>GitHu</w:t>
+          <w:t>LinkedIn</w:t>
+        </w:r>
+      </w:hyperlink>
+      <w:r>
+        <w:rPr>
+          <w:sz w:val="19"/>
+          <w:szCs w:val="19"/>
+        </w:rPr>
+        <w:t xml:space="preserve">  </w:t>
+      </w:r>
+      <w:r>
+        <w:rPr>
+          <w:sz w:val="19"/>
+          <w:szCs w:val="19"/>
+        </w:rPr>
+        <w:t>•</w:t>
+      </w:r>
+      <w:r>
+        <w:rPr>
+          <w:sz w:val="19"/>
+          <w:szCs w:val="19"/>
+        </w:rPr>
+        <w:t xml:space="preserve">  </w:t>
+      </w:r>
+      <w:hyperlink r:id="rId6" w:history="1">
+        <w:r>
+          <w:rPr>
+            <w:rStyle w:val="Hyperlink"/>
+            <w:sz w:val="19"/>
+            <w:szCs w:val="19"/>
+          </w:rPr>
+          <w:t>GitHub</w:t>
+        </w:r>
+      </w:hyperlink>
+      <w:r>
+        <w:rPr>
+          <w:sz w:val="19"/>
+          <w:szCs w:val="19"/>
+        </w:rPr>
+        <w:t xml:space="preserve">  </w:t>
+      </w:r>
+      <w:r>
+        <w:rPr>
+          <w:sz w:val="19"/>
+          <w:szCs w:val="19"/>
+        </w:rPr>
+        <w:t xml:space="preserve">•  </w:t>
+      </w:r>
+      <w:hyperlink r:id="rId7" w:history="1">
+        <w:proofErr w:type="spellStart"/>
+        <w:r>
+          <w:rPr>
+            <w:rStyle w:val="Hyperlink"/>
+            <w:sz w:val="19"/>
+            <w:szCs w:val="19"/>
+          </w:rPr>
+          <w:t>Portfol</w:t>
         </w:r>
         <w:r>
           <w:rPr>
@@ -208,16 +157,18 @@
             <w:sz w:val="19"/>
             <w:szCs w:val="19"/>
           </w:rPr>
-          <w:t>b</w:t>
+          <w:t>i</w:t>
+        </w:r>
+        <w:r>
+          <w:rPr>
+            <w:rStyle w:val="Hyperlink"/>
+            <w:sz w:val="19"/>
+            <w:szCs w:val="19"/>
+          </w:rPr>
+          <w:t>o</w:t>
         </w:r>
       </w:hyperlink>
-      <w:r>
-        <w:rPr>
-          <w:sz w:val="19"/>
-          <w:szCs w:val="19"/>
-        </w:rPr>
-        <w:t xml:space="preserve">  </w:t>
-      </w:r>
+      <w:proofErr w:type="spellEnd"/>
     </w:p>
     <w:p>
       <w:pPr>

</xml_diff>

<commit_message>
Update resume DOCX and regenerate PDF from latest Business Strategy Analyst version.
Co-authored-by: Cursor <cursoragent@cursor.com>
</commit_message>
<xml_diff>
--- a/resume/Shrey_Resume_Business_Strategy_Analyst.docx
+++ b/resume/Shrey_Resume_Business_Strategy_Analyst.docx
@@ -142,33 +142,15 @@
         <w:t xml:space="preserve">•  </w:t>
       </w:r>
       <w:hyperlink r:id="rId7" w:history="1">
-        <w:proofErr w:type="spellStart"/>
         <w:r>
           <w:rPr>
             <w:rStyle w:val="Hyperlink"/>
             <w:sz w:val="19"/>
             <w:szCs w:val="19"/>
           </w:rPr>
-          <w:t>Portfol</w:t>
-        </w:r>
-        <w:r>
-          <w:rPr>
-            <w:rStyle w:val="Hyperlink"/>
-            <w:sz w:val="19"/>
-            <w:szCs w:val="19"/>
-          </w:rPr>
-          <w:t>i</w:t>
-        </w:r>
-        <w:r>
-          <w:rPr>
-            <w:rStyle w:val="Hyperlink"/>
-            <w:sz w:val="19"/>
-            <w:szCs w:val="19"/>
-          </w:rPr>
-          <w:t>o</w:t>
+          <w:t>Portfolio</w:t>
         </w:r>
       </w:hyperlink>
-      <w:proofErr w:type="spellEnd"/>
     </w:p>
     <w:p>
       <w:pPr>
@@ -236,7 +218,7 @@
       </w:r>
       <w:r>
         <w:tab/>
-        <w:t>Expected: Dec 2026</w:t>
+        <w:t>Dec 2026</w:t>
       </w:r>
     </w:p>
     <w:p>
@@ -272,15 +254,58 @@
         <w:spacing w:after="14"/>
       </w:pPr>
       <w:r>
-        <w:t>GPA: 3.85/4.</w:t>
-      </w:r>
-      <w:proofErr w:type="gramStart"/>
-      <w:r>
-        <w:t>00  |</w:t>
-      </w:r>
-      <w:proofErr w:type="gramEnd"/>
-      <w:r>
-        <w:t xml:space="preserve">  Relevant Coursework: Business Analysis, Strategic Planning, Risk Management, Project Management Fundamentals</w:t>
+        <w:t xml:space="preserve">Relevant Coursework: </w:t>
+      </w:r>
+      <w:r>
+        <w:t>Foundations of Project Management</w:t>
+      </w:r>
+      <w:r>
+        <w:t xml:space="preserve">, </w:t>
+      </w:r>
+      <w:r>
+        <w:t>Schedule, and Cost Mgt.</w:t>
+      </w:r>
+      <w:r>
+        <w:t xml:space="preserve">, </w:t>
+      </w:r>
+      <w:r>
+        <w:t>Project Risk Management</w:t>
+      </w:r>
+      <w:r>
+        <w:t xml:space="preserve">, </w:t>
+      </w:r>
+      <w:r>
+        <w:t>Project Finance</w:t>
+      </w:r>
+      <w:r>
+        <w:t xml:space="preserve">, </w:t>
+      </w:r>
+      <w:r>
+        <w:t>Project Quality Management</w:t>
+      </w:r>
+      <w:r>
+        <w:t xml:space="preserve">, </w:t>
+      </w:r>
+      <w:r>
+        <w:t>Foundations of Project Business Analysis</w:t>
+      </w:r>
+      <w:r>
+        <w:t xml:space="preserve">, </w:t>
+      </w:r>
+      <w:r>
+        <w:t>Product Requirements Design and Ownership</w:t>
+      </w:r>
+      <w:r>
+        <w:t xml:space="preserve">, </w:t>
+      </w:r>
+      <w:r>
+        <w:t>Quant. and Qual. Methods for Bus. Analysis</w:t>
+      </w:r>
+      <w:r>
+        <w:t xml:space="preserve">, </w:t>
+      </w:r>
+      <w:r>
+        <w:t>Advanced Seminar in Business Analysis</w:t>
       </w:r>
     </w:p>
     <w:p>
@@ -351,7 +376,13 @@
         <w:spacing w:after="14"/>
       </w:pPr>
       <w:r>
-        <w:t>Coordinated daily standups and sprint tracking for a cross-functional team of 12+ engineers and PMs, maintaining synchronized delivery across six parallel AI products with no milestone gaps.</w:t>
+        <w:t>Coordinated daily standups and sprint tracking for a cross-functional team of 1</w:t>
+      </w:r>
+      <w:r>
+        <w:t>8</w:t>
+      </w:r>
+      <w:r>
+        <w:t>+ engineers, designers, and PMs, ensuring alignment and on-time delivery across six concurrent AI products.</w:t>
       </w:r>
     </w:p>
     <w:p>
@@ -364,23 +395,7 @@
         <w:spacing w:after="14"/>
       </w:pPr>
       <w:r>
-        <w:t xml:space="preserve">Translated </w:t>
-      </w:r>
-      <w:proofErr w:type="gramStart"/>
-      <w:r>
-        <w:t>product</w:t>
-      </w:r>
-      <w:proofErr w:type="gramEnd"/>
-      <w:r>
-        <w:t xml:space="preserve"> </w:t>
-      </w:r>
-      <w:proofErr w:type="gramStart"/>
-      <w:r>
-        <w:t>needs into</w:t>
-      </w:r>
-      <w:proofErr w:type="gramEnd"/>
-      <w:r>
-        <w:t xml:space="preserve"> UI/UX prototypes for the WhatsApp Summary Bot and Stake AI using Stitch (Google) and Cursor, moving both products from requirements into active development within the same sprint.</w:t>
+        <w:t>Designed and validated UI/UX prototypes for multiple AI initiatives, including Stake AI and a WhatsApp Summary Bot, using Stitch (Google), Claude Design, and Cursor. Developed experimental prototypes to evaluate and refine Design.md standards and UI/UX guidelines.</w:t>
       </w:r>
     </w:p>
     <w:p>
@@ -393,7 +408,7 @@
         <w:spacing w:after="14"/>
       </w:pPr>
       <w:r>
-        <w:t>Ran compliance reviews and a structured audit across five products and a 12+ person team, producing individual audit scorecards and a leadership portfolio summary — a gap analysis and stakeholder-reporting effort that closed a 7-point compliance gap.</w:t>
+        <w:t>Accelerated product delivery by translating requirements into development-ready specifications and moving features from planning to implementation within the same sprint cycle.</w:t>
       </w:r>
     </w:p>
     <w:p>
@@ -406,152 +421,7 @@
         <w:spacing w:after="14"/>
       </w:pPr>
       <w:r>
-        <w:t>Partnered with senior leadership to define and roll out a company-wide tokenized design system as a single source of truth synced across Notion, GitHub, Figma, and code, raising compliance from 85% to 92%.</w:t>
-      </w:r>
-    </w:p>
-    <w:p>
-      <w:pPr>
-        <w:pBdr>
-          <w:bottom w:val="single" w:sz="6" w:space="1" w:color="000000"/>
-        </w:pBdr>
-        <w:spacing w:before="100" w:after="30"/>
-      </w:pPr>
-      <w:r>
-        <w:rPr>
-          <w:b/>
-          <w:bCs/>
-          <w:sz w:val="24"/>
-          <w:szCs w:val="24"/>
-        </w:rPr>
-        <w:t>TECHNICAL SKILLS</w:t>
-      </w:r>
-    </w:p>
-    <w:p>
-      <w:pPr>
-        <w:spacing w:after="40"/>
-      </w:pPr>
-      <w:r>
-        <w:rPr>
-          <w:b/>
-          <w:bCs/>
-        </w:rPr>
-        <w:t xml:space="preserve">Core Competencies: </w:t>
-      </w:r>
-      <w:r>
-        <w:t>Business Analysis, Requirements Gathering (BRDs), Stakeholder Management, Process Improvement, Strategic Planning, Gap Analysis, Root Cause Analysis, Process Mapping, Workflow Design, UAT, Dashboard Development, Data Analysis</w:t>
-      </w:r>
-    </w:p>
-    <w:p>
-      <w:pPr>
-        <w:spacing w:after="40"/>
-      </w:pPr>
-      <w:r>
-        <w:rPr>
-          <w:b/>
-          <w:bCs/>
-        </w:rPr>
-        <w:t xml:space="preserve">Methodologies: </w:t>
-      </w:r>
-      <w:r>
-        <w:t>SDLC, Change Control, Sprint Planning, Waterfall, RACI, OKRs, KPIs</w:t>
-      </w:r>
-    </w:p>
-    <w:p>
-      <w:pPr>
-        <w:spacing w:after="40"/>
-      </w:pPr>
-      <w:r>
-        <w:rPr>
-          <w:b/>
-          <w:bCs/>
-        </w:rPr>
-        <w:t xml:space="preserve">Tools/Platforms: </w:t>
-      </w:r>
-      <w:r>
-        <w:t>MS Excel, MS Project, Primavera, SharePoint, Notion, Figma, MS PowerPoint, Claude Design, Stitch (Google), Canva</w:t>
-      </w:r>
-    </w:p>
-    <w:p>
-      <w:pPr>
-        <w:pBdr>
-          <w:bottom w:val="single" w:sz="6" w:space="1" w:color="000000"/>
-        </w:pBdr>
-        <w:spacing w:before="100" w:after="30"/>
-      </w:pPr>
-      <w:r>
-        <w:rPr>
-          <w:b/>
-          <w:bCs/>
-          <w:sz w:val="24"/>
-          <w:szCs w:val="24"/>
-        </w:rPr>
-        <w:t>PROJECTS</w:t>
-      </w:r>
-    </w:p>
-    <w:p>
-      <w:pPr>
-        <w:tabs>
-          <w:tab w:val="right" w:pos="10224"/>
-        </w:tabs>
-        <w:spacing w:before="60"/>
-      </w:pPr>
-      <w:r>
-        <w:rPr>
-          <w:b/>
-          <w:bCs/>
-        </w:rPr>
-        <w:t>UI/UX Guidelines &amp; Design System (design.md)</w:t>
-      </w:r>
-      <w:r>
-        <w:tab/>
-        <w:t>Jan 2026 – Jun 2026</w:t>
-      </w:r>
-    </w:p>
-    <w:p>
-      <w:pPr>
-        <w:tabs>
-          <w:tab w:val="right" w:pos="10224"/>
-        </w:tabs>
-        <w:spacing w:after="50"/>
-      </w:pPr>
-      <w:r>
-        <w:rPr>
-          <w:i/>
-          <w:iCs/>
-        </w:rPr>
-        <w:t>Notion, GitHub, Figma, CSS/Tokens (</w:t>
-      </w:r>
-      <w:proofErr w:type="spellStart"/>
-      <w:proofErr w:type="gramStart"/>
-      <w:r>
-        <w:rPr>
-          <w:i/>
-          <w:iCs/>
-        </w:rPr>
-        <w:t>aosenuma.tokens</w:t>
-      </w:r>
-      <w:proofErr w:type="gramEnd"/>
-      <w:r>
-        <w:rPr>
-          <w:i/>
-          <w:iCs/>
-        </w:rPr>
-        <w:t>.json</w:t>
-      </w:r>
-      <w:proofErr w:type="spellEnd"/>
-      <w:r>
-        <w:rPr>
-          <w:i/>
-          <w:iCs/>
-        </w:rPr>
-        <w:t>)</w:t>
-      </w:r>
-      <w:r>
-        <w:rPr>
-          <w:i/>
-          <w:iCs/>
-        </w:rPr>
-        <w:tab/>
+        <w:t>Conducted compliance and design quality audits across AI product prototypes, created detailed scorecards, identified improvement opportunities, and presented executive-level summaries to leadership.</w:t>
       </w:r>
     </w:p>
     <w:p>
@@ -564,7 +434,155 @@
         <w:spacing w:after="14"/>
       </w:pPr>
       <w:r>
-        <w:t>Defined requirements and standards for a company-wide design system — color tokens, semantic palettes, accessibility rules, and component standards — documented in a machine-readable token file synced across Notion, GitHub, and code.</w:t>
+        <w:t>Partnered with senior leadership to implement a tokenized design system spanning Notion, GitHub, Figma, and production code, improving design consistency and increasing compliance scores from 85% to 92%</w:t>
+      </w:r>
+      <w:r>
+        <w:t>.</w:t>
+      </w:r>
+    </w:p>
+    <w:p>
+      <w:pPr>
+        <w:pBdr>
+          <w:bottom w:val="single" w:sz="6" w:space="1" w:color="000000"/>
+        </w:pBdr>
+        <w:spacing w:before="100" w:after="30"/>
+      </w:pPr>
+      <w:r>
+        <w:rPr>
+          <w:b/>
+          <w:bCs/>
+          <w:sz w:val="24"/>
+          <w:szCs w:val="24"/>
+        </w:rPr>
+        <w:t>TECHNICAL SKILLS</w:t>
+      </w:r>
+    </w:p>
+    <w:p>
+      <w:pPr>
+        <w:spacing w:after="40"/>
+      </w:pPr>
+      <w:r>
+        <w:rPr>
+          <w:b/>
+          <w:bCs/>
+        </w:rPr>
+        <w:t xml:space="preserve">Core Competencies: </w:t>
+      </w:r>
+      <w:r>
+        <w:t>Business Analysis, Requirements Gathering (BRDs), Stakeholder Management, Process Improvement, Strategic Planning, Gap Analysis, Root Cause Analysis, Process Mapping, Workflow Design, UAT, Dashboard Development, Data Analysis</w:t>
+      </w:r>
+    </w:p>
+    <w:p>
+      <w:pPr>
+        <w:spacing w:after="40"/>
+      </w:pPr>
+      <w:r>
+        <w:rPr>
+          <w:b/>
+          <w:bCs/>
+        </w:rPr>
+        <w:t xml:space="preserve">Methodologies: </w:t>
+      </w:r>
+      <w:r>
+        <w:t>SDLC, Change Control, Sprint Planning, Waterfall, RACI, OKRs, KPIs</w:t>
+      </w:r>
+    </w:p>
+    <w:p>
+      <w:pPr>
+        <w:spacing w:after="40"/>
+      </w:pPr>
+      <w:r>
+        <w:rPr>
+          <w:b/>
+          <w:bCs/>
+        </w:rPr>
+        <w:t xml:space="preserve">Tools/Platforms: </w:t>
+      </w:r>
+      <w:r>
+        <w:t>MS Excel, MS Project, Primavera, Notion, Figma, MS PowerPoint, Claude Design, Stitch</w:t>
+      </w:r>
+    </w:p>
+    <w:p>
+      <w:pPr>
+        <w:pBdr>
+          <w:bottom w:val="single" w:sz="6" w:space="1" w:color="000000"/>
+        </w:pBdr>
+        <w:spacing w:before="100" w:after="30"/>
+      </w:pPr>
+      <w:r>
+        <w:rPr>
+          <w:b/>
+          <w:bCs/>
+          <w:sz w:val="24"/>
+          <w:szCs w:val="24"/>
+        </w:rPr>
+        <w:t>PROJECTS</w:t>
+      </w:r>
+    </w:p>
+    <w:p>
+      <w:pPr>
+        <w:tabs>
+          <w:tab w:val="right" w:pos="10224"/>
+        </w:tabs>
+        <w:spacing w:before="60"/>
+      </w:pPr>
+      <w:r>
+        <w:rPr>
+          <w:b/>
+          <w:bCs/>
+        </w:rPr>
+        <w:t>UI/UX Guidelines &amp; Design System (design.md)</w:t>
+      </w:r>
+      <w:r>
+        <w:tab/>
+        <w:t>Jan 2026 – Jun 2026</w:t>
+      </w:r>
+    </w:p>
+    <w:p>
+      <w:pPr>
+        <w:tabs>
+          <w:tab w:val="right" w:pos="10224"/>
+        </w:tabs>
+        <w:spacing w:after="50"/>
+      </w:pPr>
+      <w:r>
+        <w:rPr>
+          <w:i/>
+          <w:iCs/>
+        </w:rPr>
+        <w:t>Notion, GitHub, CSS/Tokens (</w:t>
+      </w:r>
+      <w:proofErr w:type="spellStart"/>
+      <w:proofErr w:type="gramStart"/>
+      <w:r>
+        <w:rPr>
+          <w:i/>
+          <w:iCs/>
+        </w:rPr>
+        <w:t>aosenuma.tokens</w:t>
+      </w:r>
+      <w:proofErr w:type="gramEnd"/>
+      <w:r>
+        <w:rPr>
+          <w:i/>
+          <w:iCs/>
+        </w:rPr>
+        <w:t>.json</w:t>
+      </w:r>
+      <w:proofErr w:type="spellEnd"/>
+      <w:r>
+        <w:rPr>
+          <w:i/>
+          <w:iCs/>
+        </w:rPr>
+        <w:t>)</w:t>
+      </w:r>
+      <w:r>
+        <w:rPr>
+          <w:i/>
+          <w:iCs/>
+        </w:rPr>
+        <w:tab/>
       </w:r>
     </w:p>
     <w:p>
@@ -577,84 +595,7 @@
         <w:spacing w:after="14"/>
       </w:pPr>
       <w:r>
-        <w:t>Established mandatory proof requirements and conducted a full compliance audit across five products, delivering a 7-point improvement (85% → 92%) and a single source of truth adopted across all active AI initiatives.</w:t>
-      </w:r>
-    </w:p>
-    <w:p>
-      <w:pPr>
-        <w:pBdr>
-          <w:bottom w:val="single" w:sz="6" w:space="1" w:color="000000"/>
-        </w:pBdr>
-        <w:spacing w:before="100" w:after="30"/>
-      </w:pPr>
-      <w:r>
-        <w:rPr>
-          <w:b/>
-          <w:bCs/>
-          <w:sz w:val="24"/>
-          <w:szCs w:val="24"/>
-        </w:rPr>
-        <w:t>LEADERSHIP &amp; ATHLETICS</w:t>
-      </w:r>
-    </w:p>
-    <w:p>
-      <w:pPr>
-        <w:tabs>
-          <w:tab w:val="right" w:pos="10224"/>
-        </w:tabs>
-        <w:spacing w:before="60"/>
-      </w:pPr>
-      <w:r>
-        <w:rPr>
-          <w:b/>
-          <w:bCs/>
-        </w:rPr>
-        <w:t>Northeastern Club Running (</w:t>
-      </w:r>
-      <w:proofErr w:type="gramStart"/>
-      <w:r>
-        <w:rPr>
-          <w:b/>
-          <w:bCs/>
-        </w:rPr>
-        <w:t>NUCR) —</w:t>
-      </w:r>
-      <w:proofErr w:type="gramEnd"/>
-      <w:r>
-        <w:rPr>
-          <w:b/>
-          <w:bCs/>
-        </w:rPr>
-        <w:t xml:space="preserve"> Sprinter, Track &amp; Field</w:t>
-      </w:r>
-      <w:r>
-        <w:tab/>
-      </w:r>
-      <w:r>
-        <w:t>Sept 2024 - Current</w:t>
-      </w:r>
-    </w:p>
-    <w:p>
-      <w:pPr>
-        <w:tabs>
-          <w:tab w:val="right" w:pos="10224"/>
-        </w:tabs>
-        <w:spacing w:after="50"/>
-      </w:pPr>
-      <w:r>
-        <w:rPr>
-          <w:i/>
-          <w:iCs/>
-        </w:rPr>
-        <w:t>Northeastern University Athletics</w:t>
-      </w:r>
-      <w:r>
-        <w:rPr>
-          <w:i/>
-          <w:iCs/>
-        </w:rPr>
-        <w:tab/>
-        <w:t>Boston, MA</w:t>
+        <w:t>Defined requirements and governance standards for a company-wide design system, including design tokens, semantic color palettes, accessibility guidelines, and component specifications, documented in a machine-readable framework synchronized across Notion, GitHub, and code.</w:t>
       </w:r>
     </w:p>
     <w:p>
@@ -667,7 +608,84 @@
         <w:spacing w:after="14"/>
       </w:pPr>
       <w:r>
-        <w:t>Compete for Northeastern University at regional, city, and state-level track and field competitions, demonstrating discipline, teamwork, and high-performance execution.</w:t>
+        <w:t>Established compliance review processes and evidence-based audit requirements across all AI products and product prototypes, conducting gap analyses that increased design system compliance from 85% to 92% and helped create a single source of truth adopted across active product initiatives.</w:t>
+      </w:r>
+    </w:p>
+    <w:p>
+      <w:pPr>
+        <w:pBdr>
+          <w:bottom w:val="single" w:sz="6" w:space="1" w:color="000000"/>
+        </w:pBdr>
+        <w:spacing w:before="100" w:after="30"/>
+      </w:pPr>
+      <w:r>
+        <w:rPr>
+          <w:b/>
+          <w:bCs/>
+          <w:sz w:val="24"/>
+          <w:szCs w:val="24"/>
+        </w:rPr>
+        <w:t>LEADERSHIP &amp; ATHLETICS</w:t>
+      </w:r>
+    </w:p>
+    <w:p>
+      <w:pPr>
+        <w:tabs>
+          <w:tab w:val="right" w:pos="10224"/>
+        </w:tabs>
+        <w:spacing w:before="60"/>
+      </w:pPr>
+      <w:r>
+        <w:rPr>
+          <w:b/>
+          <w:bCs/>
+        </w:rPr>
+        <w:t>Northeastern Club Running (</w:t>
+      </w:r>
+      <w:proofErr w:type="gramStart"/>
+      <w:r>
+        <w:rPr>
+          <w:b/>
+          <w:bCs/>
+        </w:rPr>
+        <w:t>NUCR) —</w:t>
+      </w:r>
+      <w:proofErr w:type="gramEnd"/>
+      <w:r>
+        <w:rPr>
+          <w:b/>
+          <w:bCs/>
+        </w:rPr>
+        <w:t xml:space="preserve"> Sprinter, Track &amp; Field</w:t>
+      </w:r>
+      <w:r>
+        <w:tab/>
+      </w:r>
+      <w:r>
+        <w:t>Sept 2024 - Current</w:t>
+      </w:r>
+    </w:p>
+    <w:p>
+      <w:pPr>
+        <w:tabs>
+          <w:tab w:val="right" w:pos="10224"/>
+        </w:tabs>
+        <w:spacing w:after="50"/>
+      </w:pPr>
+      <w:r>
+        <w:rPr>
+          <w:i/>
+          <w:iCs/>
+        </w:rPr>
+        <w:t>Northeastern University Athletics</w:t>
+      </w:r>
+      <w:r>
+        <w:rPr>
+          <w:i/>
+          <w:iCs/>
+        </w:rPr>
+        <w:tab/>
+        <w:t>Boston, MA</w:t>
       </w:r>
     </w:p>
     <w:p>
@@ -680,12 +698,25 @@
         <w:spacing w:after="14"/>
       </w:pPr>
       <w:r>
+        <w:t>Compete for Northeastern University at regional, city, and state-level track and field competitions, demonstrating discipline, teamwork, and high-performance execution.</w:t>
+      </w:r>
+    </w:p>
+    <w:p>
+      <w:pPr>
+        <w:pStyle w:val="ListParagraph"/>
+        <w:numPr>
+          <w:ilvl w:val="0"/>
+          <w:numId w:val="2"/>
+        </w:numPr>
+        <w:spacing w:after="14"/>
+      </w:pPr>
+      <w:r>
         <w:t>Support university and community sporting events at Northeastern Athletics Facilities, assisting with event logistics and operations.</w:t>
       </w:r>
     </w:p>
     <w:sectPr>
       <w:pgSz w:w="12240" w:h="15840"/>
-      <w:pgMar w:top="864" w:right="1008" w:bottom="864" w:left="1008" w:header="708" w:footer="708" w:gutter="0"/>
+      <w:pgMar w:top="680" w:right="737" w:bottom="680" w:left="737" w:header="709" w:footer="709" w:gutter="0"/>
       <w:cols w:space="720"/>
       <w:docGrid w:linePitch="360"/>
     </w:sectPr>
@@ -1332,7 +1363,6 @@
   <w:style w:type="character" w:default="1" w:styleId="DefaultParagraphFont">
     <w:name w:val="Default Paragraph Font"/>
     <w:uiPriority w:val="1"/>
-    <w:semiHidden/>
     <w:unhideWhenUsed/>
   </w:style>
   <w:style w:type="table" w:default="1" w:styleId="TableNormal">

</xml_diff>

<commit_message>
Fix portfolio credibility gaps: timeline consistency, resume sync, and deduped metrics.
Co-authored-by: Cursor <cursoragent@cursor.com>
</commit_message>
<xml_diff>
--- a/resume/Shrey_Resume_Business_Strategy_Analyst.docx
+++ b/resume/Shrey_Resume_Business_Strategy_Analyst.docx
@@ -36,55 +36,7 @@
           <w:sz w:val="19"/>
           <w:szCs w:val="19"/>
         </w:rPr>
-        <w:t xml:space="preserve">Boston, </w:t>
-      </w:r>
-      <w:proofErr w:type="gramStart"/>
-      <w:r>
-        <w:rPr>
-          <w:sz w:val="19"/>
-          <w:szCs w:val="19"/>
-        </w:rPr>
-        <w:t>MA  •</w:t>
-      </w:r>
-      <w:proofErr w:type="gramEnd"/>
-      <w:r>
-        <w:rPr>
-          <w:sz w:val="19"/>
-          <w:szCs w:val="19"/>
-        </w:rPr>
-        <w:t xml:space="preserve">  857-364-</w:t>
-      </w:r>
-      <w:proofErr w:type="gramStart"/>
-      <w:r>
-        <w:rPr>
-          <w:sz w:val="19"/>
-          <w:szCs w:val="19"/>
-        </w:rPr>
-        <w:t>1539  •</w:t>
-      </w:r>
-      <w:proofErr w:type="gramEnd"/>
-      <w:r>
-        <w:rPr>
-          <w:sz w:val="19"/>
-          <w:szCs w:val="19"/>
-        </w:rPr>
-        <w:t xml:space="preserve">  </w:t>
-      </w:r>
-      <w:proofErr w:type="gramStart"/>
-      <w:r>
-        <w:rPr>
-          <w:sz w:val="19"/>
-          <w:szCs w:val="19"/>
-        </w:rPr>
-        <w:t>shirke.sh@northeastern.edu  •</w:t>
-      </w:r>
-      <w:proofErr w:type="gramEnd"/>
-      <w:r>
-        <w:rPr>
-          <w:sz w:val="19"/>
-          <w:szCs w:val="19"/>
-        </w:rPr>
-        <w:t xml:space="preserve">  </w:t>
+        <w:t xml:space="preserve">Boston, MA  •  857-364-1539  •  shirke.sh@northeastern.edu  •  </w:t>
       </w:r>
       <w:hyperlink r:id="rId5" w:history="1">
         <w:r>
@@ -174,15 +126,16 @@
         <w:spacing w:after="50"/>
       </w:pPr>
       <w:r>
-        <w:t xml:space="preserve">Business and strategy analyst with experience supporting cross-functional initiatives across AI product development and operations. Skilled in requirements gathering (BRDs), stakeholder management, process improvement, gap analysis, and dashboard reporting, with a record of driving operational efficiency and closing measurable performance gaps. National-level sprinter and Northeastern </w:t>
-      </w:r>
-      <w:proofErr w:type="gramStart"/>
-      <w:r>
-        <w:t>athlete</w:t>
-      </w:r>
-      <w:proofErr w:type="gramEnd"/>
-      <w:r>
-        <w:t xml:space="preserve"> recognized for discipline, resilience, and high-performance execution in demanding environments.</w:t>
+        <w:t>Business and strategy analyst completing an M.S. in Project Management at Northeastern, with a Business Analysis concentration.</w:t>
+      </w:r>
+      <w:r>
+        <w:t xml:space="preserve"> </w:t>
+      </w:r>
+      <w:r>
+        <w:t>Skilled in stakeholder reporting, process improvement, and design governance on AI product teams.</w:t>
+      </w:r>
+      <w:r>
+        <w:t xml:space="preserve"> </w:t>
       </w:r>
     </w:p>
     <w:p>
@@ -382,7 +335,10 @@
         <w:t>8</w:t>
       </w:r>
       <w:r>
-        <w:t>+ engineers, designers, and PMs, ensuring alignment and on-time delivery across six concurrent AI products.</w:t>
+        <w:t xml:space="preserve">+ engineers, designers, and PMs, </w:t>
+      </w:r>
+      <w:r>
+        <w:t>across six AI products over a six-month co-op, ensuring alignment on priorities, blockers, and delivery timelines.</w:t>
       </w:r>
     </w:p>
     <w:p>
@@ -434,7 +390,10 @@
         <w:spacing w:after="14"/>
       </w:pPr>
       <w:r>
-        <w:t>Partnered with senior leadership to implement a tokenized design system spanning Notion, GitHub, Figma, and production code, improving design consistency and increasing compliance scores from 85% to 92%</w:t>
+        <w:t xml:space="preserve">Partnered with senior leadership to implement a tokenized design system spanning Notion, GitHub, Figma, and production code, </w:t>
+      </w:r>
+      <w:r>
+        <w:t>establishing a single source of truth for design consistency across active products</w:t>
       </w:r>
       <w:r>
         <w:t>.</w:t>
@@ -446,61 +405,13 @@
           <w:bottom w:val="single" w:sz="6" w:space="1" w:color="000000"/>
         </w:pBdr>
         <w:spacing w:before="100" w:after="30"/>
-      </w:pPr>
-      <w:r>
-        <w:rPr>
-          <w:b/>
-          <w:bCs/>
-          <w:sz w:val="24"/>
-          <w:szCs w:val="24"/>
-        </w:rPr>
-        <w:t>TECHNICAL SKILLS</w:t>
-      </w:r>
-    </w:p>
-    <w:p>
-      <w:pPr>
-        <w:spacing w:after="40"/>
-      </w:pPr>
-      <w:r>
-        <w:rPr>
-          <w:b/>
-          <w:bCs/>
-        </w:rPr>
-        <w:t xml:space="preserve">Core Competencies: </w:t>
-      </w:r>
-      <w:r>
-        <w:t>Business Analysis, Requirements Gathering (BRDs), Stakeholder Management, Process Improvement, Strategic Planning, Gap Analysis, Root Cause Analysis, Process Mapping, Workflow Design, UAT, Dashboard Development, Data Analysis</w:t>
-      </w:r>
-    </w:p>
-    <w:p>
-      <w:pPr>
-        <w:spacing w:after="40"/>
-      </w:pPr>
-      <w:r>
-        <w:rPr>
-          <w:b/>
-          <w:bCs/>
-        </w:rPr>
-        <w:t xml:space="preserve">Methodologies: </w:t>
-      </w:r>
-      <w:r>
-        <w:t>SDLC, Change Control, Sprint Planning, Waterfall, RACI, OKRs, KPIs</w:t>
-      </w:r>
-    </w:p>
-    <w:p>
-      <w:pPr>
-        <w:spacing w:after="40"/>
-      </w:pPr>
-      <w:r>
-        <w:rPr>
-          <w:b/>
-          <w:bCs/>
-        </w:rPr>
-        <w:t xml:space="preserve">Tools/Platforms: </w:t>
-      </w:r>
-      <w:r>
-        <w:t>MS Excel, MS Project, Primavera, Notion, Figma, MS PowerPoint, Claude Design, Stitch</w:t>
-      </w:r>
+        <w:rPr>
+          <w:b/>
+          <w:bCs/>
+          <w:sz w:val="24"/>
+          <w:szCs w:val="24"/>
+        </w:rPr>
+      </w:pPr>
     </w:p>
     <w:p>
       <w:pPr>
@@ -508,6 +419,359 @@
           <w:bottom w:val="single" w:sz="6" w:space="1" w:color="000000"/>
         </w:pBdr>
         <w:spacing w:before="100" w:after="30"/>
+        <w:rPr>
+          <w:b/>
+          <w:bCs/>
+          <w:sz w:val="24"/>
+          <w:szCs w:val="24"/>
+        </w:rPr>
+      </w:pPr>
+    </w:p>
+    <w:p>
+      <w:pPr>
+        <w:pBdr>
+          <w:bottom w:val="single" w:sz="6" w:space="1" w:color="000000"/>
+        </w:pBdr>
+        <w:spacing w:before="100" w:after="30"/>
+        <w:rPr>
+          <w:b/>
+          <w:bCs/>
+          <w:sz w:val="24"/>
+          <w:szCs w:val="24"/>
+        </w:rPr>
+      </w:pPr>
+      <w:r>
+        <w:rPr>
+          <w:b/>
+          <w:bCs/>
+          <w:sz w:val="24"/>
+          <w:szCs w:val="24"/>
+        </w:rPr>
+        <w:t>Athletics Facilities Staff</w:t>
+      </w:r>
+    </w:p>
+    <w:p>
+      <w:pPr>
+        <w:pBdr>
+          <w:bottom w:val="single" w:sz="6" w:space="1" w:color="000000"/>
+        </w:pBdr>
+        <w:spacing w:before="100" w:after="30"/>
+        <w:rPr>
+          <w:b/>
+          <w:bCs/>
+          <w:sz w:val="24"/>
+          <w:szCs w:val="24"/>
+        </w:rPr>
+      </w:pPr>
+      <w:r>
+        <w:rPr>
+          <w:b/>
+          <w:bCs/>
+          <w:sz w:val="24"/>
+          <w:szCs w:val="24"/>
+        </w:rPr>
+        <w:t>Dec 2025 - Present</w:t>
+      </w:r>
+    </w:p>
+    <w:p>
+      <w:pPr>
+        <w:pBdr>
+          <w:bottom w:val="single" w:sz="6" w:space="1" w:color="000000"/>
+        </w:pBdr>
+        <w:spacing w:before="100" w:after="30"/>
+        <w:rPr>
+          <w:b/>
+          <w:bCs/>
+          <w:sz w:val="24"/>
+          <w:szCs w:val="24"/>
+        </w:rPr>
+      </w:pPr>
+      <w:r>
+        <w:rPr>
+          <w:b/>
+          <w:bCs/>
+          <w:sz w:val="24"/>
+          <w:szCs w:val="24"/>
+        </w:rPr>
+        <w:t>Northeastern University Athletics | Boston, MA</w:t>
+      </w:r>
+    </w:p>
+    <w:p>
+      <w:pPr>
+        <w:pBdr>
+          <w:bottom w:val="single" w:sz="6" w:space="1" w:color="000000"/>
+        </w:pBdr>
+        <w:spacing w:before="100" w:after="30"/>
+        <w:rPr>
+          <w:b/>
+          <w:bCs/>
+          <w:sz w:val="24"/>
+          <w:szCs w:val="24"/>
+        </w:rPr>
+      </w:pPr>
+      <w:r>
+        <w:rPr>
+          <w:b/>
+          <w:bCs/>
+          <w:sz w:val="24"/>
+          <w:szCs w:val="24"/>
+        </w:rPr>
+        <w:t>Supported game-day operations for varsity events.</w:t>
+      </w:r>
+    </w:p>
+    <w:p>
+      <w:pPr>
+        <w:pBdr>
+          <w:bottom w:val="single" w:sz="6" w:space="1" w:color="000000"/>
+        </w:pBdr>
+        <w:spacing w:before="100" w:after="30"/>
+        <w:rPr>
+          <w:b/>
+          <w:bCs/>
+          <w:sz w:val="24"/>
+          <w:szCs w:val="24"/>
+        </w:rPr>
+      </w:pPr>
+      <w:r>
+        <w:rPr>
+          <w:b/>
+          <w:bCs/>
+          <w:sz w:val="24"/>
+          <w:szCs w:val="24"/>
+        </w:rPr>
+        <w:t>Coordinated event setup, crowd flow, and operational support.</w:t>
+      </w:r>
+    </w:p>
+    <w:p>
+      <w:pPr>
+        <w:pBdr>
+          <w:bottom w:val="single" w:sz="6" w:space="1" w:color="000000"/>
+        </w:pBdr>
+        <w:spacing w:before="100" w:after="30"/>
+        <w:rPr>
+          <w:b/>
+          <w:bCs/>
+          <w:sz w:val="24"/>
+          <w:szCs w:val="24"/>
+        </w:rPr>
+      </w:pPr>
+      <w:r>
+        <w:rPr>
+          <w:b/>
+          <w:bCs/>
+          <w:sz w:val="24"/>
+          <w:szCs w:val="24"/>
+        </w:rPr>
+        <w:t>Assisted daily facility operations and customer service.</w:t>
+      </w:r>
+    </w:p>
+    <w:p>
+      <w:pPr>
+        <w:pBdr>
+          <w:bottom w:val="single" w:sz="6" w:space="1" w:color="000000"/>
+        </w:pBdr>
+        <w:spacing w:before="100" w:after="30"/>
+        <w:rPr>
+          <w:b/>
+          <w:bCs/>
+          <w:sz w:val="24"/>
+          <w:szCs w:val="24"/>
+        </w:rPr>
+      </w:pPr>
+    </w:p>
+    <w:p>
+      <w:pPr>
+        <w:pBdr>
+          <w:bottom w:val="single" w:sz="6" w:space="1" w:color="000000"/>
+        </w:pBdr>
+        <w:spacing w:before="100" w:after="30"/>
+        <w:rPr>
+          <w:b/>
+          <w:bCs/>
+          <w:sz w:val="24"/>
+          <w:szCs w:val="24"/>
+        </w:rPr>
+      </w:pPr>
+      <w:r>
+        <w:rPr>
+          <w:b/>
+          <w:bCs/>
+          <w:sz w:val="24"/>
+          <w:szCs w:val="24"/>
+        </w:rPr>
+        <w:t>RSO Proctor</w:t>
+      </w:r>
+    </w:p>
+    <w:p>
+      <w:pPr>
+        <w:pBdr>
+          <w:bottom w:val="single" w:sz="6" w:space="1" w:color="000000"/>
+        </w:pBdr>
+        <w:spacing w:before="100" w:after="30"/>
+        <w:rPr>
+          <w:b/>
+          <w:bCs/>
+          <w:sz w:val="24"/>
+          <w:szCs w:val="24"/>
+        </w:rPr>
+      </w:pPr>
+      <w:r>
+        <w:rPr>
+          <w:b/>
+          <w:bCs/>
+          <w:sz w:val="24"/>
+          <w:szCs w:val="24"/>
+        </w:rPr>
+        <w:t>Dec 2025 - Present</w:t>
+      </w:r>
+    </w:p>
+    <w:p>
+      <w:pPr>
+        <w:pBdr>
+          <w:bottom w:val="single" w:sz="6" w:space="1" w:color="000000"/>
+        </w:pBdr>
+        <w:spacing w:before="100" w:after="30"/>
+        <w:rPr>
+          <w:b/>
+          <w:bCs/>
+          <w:sz w:val="24"/>
+          <w:szCs w:val="24"/>
+        </w:rPr>
+      </w:pPr>
+      <w:r>
+        <w:rPr>
+          <w:b/>
+          <w:bCs/>
+          <w:sz w:val="24"/>
+          <w:szCs w:val="24"/>
+        </w:rPr>
+        <w:t>Northeastern University | Boston, MA</w:t>
+      </w:r>
+    </w:p>
+    <w:p>
+      <w:pPr>
+        <w:pBdr>
+          <w:bottom w:val="single" w:sz="6" w:space="1" w:color="000000"/>
+        </w:pBdr>
+        <w:spacing w:before="100" w:after="30"/>
+        <w:rPr>
+          <w:b/>
+          <w:bCs/>
+          <w:sz w:val="24"/>
+          <w:szCs w:val="24"/>
+        </w:rPr>
+      </w:pPr>
+      <w:r>
+        <w:rPr>
+          <w:b/>
+          <w:bCs/>
+          <w:sz w:val="24"/>
+          <w:szCs w:val="24"/>
+        </w:rPr>
+        <w:t>Monitored residence hall access and verified entry.</w:t>
+      </w:r>
+    </w:p>
+    <w:p>
+      <w:pPr>
+        <w:pBdr>
+          <w:bottom w:val="single" w:sz="6" w:space="1" w:color="000000"/>
+        </w:pBdr>
+        <w:spacing w:before="100" w:after="30"/>
+        <w:rPr>
+          <w:b/>
+          <w:bCs/>
+          <w:sz w:val="24"/>
+          <w:szCs w:val="24"/>
+        </w:rPr>
+      </w:pPr>
+      <w:r>
+        <w:rPr>
+          <w:b/>
+          <w:bCs/>
+          <w:sz w:val="24"/>
+          <w:szCs w:val="24"/>
+        </w:rPr>
+        <w:t>Assisted check-ins, visitor management, and front-desk operations.</w:t>
+      </w:r>
+    </w:p>
+    <w:p>
+      <w:pPr>
+        <w:pBdr>
+          <w:bottom w:val="single" w:sz="6" w:space="1" w:color="000000"/>
+        </w:pBdr>
+        <w:spacing w:before="100" w:after="30"/>
+      </w:pPr>
+      <w:r>
+        <w:rPr>
+          <w:b/>
+          <w:bCs/>
+          <w:sz w:val="24"/>
+          <w:szCs w:val="24"/>
+        </w:rPr>
+        <w:t>Supported housing policies and incident reporting.</w:t>
+      </w:r>
+      <w:r>
+        <w:rPr>
+          <w:b/>
+          <w:bCs/>
+          <w:sz w:val="24"/>
+          <w:szCs w:val="24"/>
+        </w:rPr>
+        <w:t>TECHNICAL SKILLS</w:t>
+      </w:r>
+    </w:p>
+    <w:p>
+      <w:pPr>
+        <w:spacing w:after="40"/>
+      </w:pPr>
+      <w:r>
+        <w:rPr>
+          <w:b/>
+          <w:bCs/>
+        </w:rPr>
+        <w:t xml:space="preserve">Core Competencies: </w:t>
+      </w:r>
+      <w:r>
+        <w:t>Business Analysis, Requirements Gathering (BRDs), Stakeholder Management, Process Improvement, Strategic Planning, Gap Analysis, Root Cause Analysis, Process Mapping, Workflow Design, UAT, Dashboard Development, Data Analysis</w:t>
+      </w:r>
+    </w:p>
+    <w:p>
+      <w:pPr>
+        <w:spacing w:after="40"/>
+      </w:pPr>
+      <w:r>
+        <w:rPr>
+          <w:b/>
+          <w:bCs/>
+        </w:rPr>
+        <w:lastRenderedPageBreak/>
+        <w:t xml:space="preserve">Methodologies: </w:t>
+      </w:r>
+      <w:r>
+        <w:t>SDLC, Change Control, Sprint Planning, Waterfall, RACI, OKRs, KPIs</w:t>
+      </w:r>
+    </w:p>
+    <w:p>
+      <w:pPr>
+        <w:spacing w:after="40"/>
+      </w:pPr>
+      <w:r>
+        <w:rPr>
+          <w:b/>
+          <w:bCs/>
+        </w:rPr>
+        <w:t xml:space="preserve">Tools/Platforms: </w:t>
+      </w:r>
+      <w:r>
+        <w:t>MS Excel, MS Project, Primavera, Notion, Figma, MS PowerPoint, Claude Design, Stitch</w:t>
+      </w:r>
+    </w:p>
+    <w:p>
+      <w:pPr>
+        <w:pBdr>
+          <w:bottom w:val="single" w:sz="6" w:space="1" w:color="000000"/>
+        </w:pBdr>
+        <w:spacing w:before="100" w:after="30"/>
       </w:pPr>
       <w:r>
         <w:rPr>
@@ -550,32 +814,7 @@
           <w:i/>
           <w:iCs/>
         </w:rPr>
-        <w:t>Notion, GitHub, CSS/Tokens (</w:t>
-      </w:r>
-      <w:proofErr w:type="spellStart"/>
-      <w:proofErr w:type="gramStart"/>
-      <w:r>
-        <w:rPr>
-          <w:i/>
-          <w:iCs/>
-        </w:rPr>
-        <w:t>aosenuma.tokens</w:t>
-      </w:r>
-      <w:proofErr w:type="gramEnd"/>
-      <w:r>
-        <w:rPr>
-          <w:i/>
-          <w:iCs/>
-        </w:rPr>
-        <w:t>.json</w:t>
-      </w:r>
-      <w:proofErr w:type="spellEnd"/>
-      <w:r>
-        <w:rPr>
-          <w:i/>
-          <w:iCs/>
-        </w:rPr>
-        <w:t>)</w:t>
+        <w:t>Notion, GitHub, CSS/Tokens (aosenuma.tokens.json)</w:t>
       </w:r>
       <w:r>
         <w:rPr>
@@ -595,7 +834,7 @@
         <w:spacing w:after="14"/>
       </w:pPr>
       <w:r>
-        <w:t>Defined requirements and governance standards for a company-wide design system, including design tokens, semantic color palettes, accessibility guidelines, and component specifications, documented in a machine-readable framework synchronized across Notion, GitHub, and code.</w:t>
+        <w:t>Five active AI products used conflicting style guides. Defined requirements for one tokenized design system, synchronized across Notion, GitHub, and code.</w:t>
       </w:r>
     </w:p>
     <w:p>
@@ -608,7 +847,13 @@
         <w:spacing w:after="14"/>
       </w:pPr>
       <w:r>
-        <w:t>Established compliance review processes and evidence-based audit requirements across all AI products and product prototypes, conducting gap analyses that increased design system compliance from 85% to 92% and helped create a single source of truth adopted across active product initiatives.</w:t>
+        <w:t>Ran compliance reviews across product prototypes,</w:t>
+      </w:r>
+      <w:r>
+        <w:t xml:space="preserve"> </w:t>
+      </w:r>
+      <w:r>
+        <w:t>conducting gap analyses; closed a 7-point compliance gap (85% to 92%).</w:t>
       </w:r>
     </w:p>
     <w:p>
@@ -640,29 +885,13 @@
           <w:b/>
           <w:bCs/>
         </w:rPr>
-        <w:t>Northeastern Club Running (</w:t>
-      </w:r>
-      <w:proofErr w:type="gramStart"/>
-      <w:r>
-        <w:rPr>
-          <w:b/>
-          <w:bCs/>
-        </w:rPr>
-        <w:t>NUCR) —</w:t>
-      </w:r>
-      <w:proofErr w:type="gramEnd"/>
-      <w:r>
-        <w:rPr>
-          <w:b/>
-          <w:bCs/>
-        </w:rPr>
-        <w:t xml:space="preserve"> Sprinter, Track &amp; Field</w:t>
+        <w:t>Northeastern Club Running (NUCR) — Sprinter, Track &amp; Field</w:t>
       </w:r>
       <w:r>
         <w:tab/>
       </w:r>
       <w:r>
-        <w:t>Sept 2024 - Current</w:t>
+        <w:t>Sept 2024 - Present</w:t>
       </w:r>
     </w:p>
     <w:p>
@@ -698,7 +927,7 @@
         <w:spacing w:after="14"/>
       </w:pPr>
       <w:r>
-        <w:t>Compete for Northeastern University at regional, city, and state-level track and field competitions, demonstrating discipline, teamwork, and high-performance execution.</w:t>
+        <w:t>Compete in sprint and relay events at regional, state, and national NIRCA (club collegiate running) meets. Ranked among the Top 20 athletes in NIRCA for sprinting and relay performance. Competed in sprint events in India before grad school.</w:t>
       </w:r>
     </w:p>
     <w:p>
@@ -710,9 +939,6 @@
         </w:numPr>
         <w:spacing w:after="14"/>
       </w:pPr>
-      <w:r>
-        <w:t>Support university and community sporting events at Northeastern Athletics Facilities, assisting with event logistics and operations.</w:t>
-      </w:r>
     </w:p>
     <w:sectPr>
       <w:pgSz w:w="12240" w:h="15840"/>
@@ -1363,6 +1589,7 @@
   <w:style w:type="character" w:default="1" w:styleId="DefaultParagraphFont">
     <w:name w:val="Default Paragraph Font"/>
     <w:uiPriority w:val="1"/>
+    <w:semiHidden/>
     <w:unhideWhenUsed/>
   </w:style>
   <w:style w:type="table" w:default="1" w:styleId="TableNormal">

</xml_diff>

<commit_message>
Revert resume DOCX and PDF to version before credibility-fix automation edits.
Co-authored-by: Cursor <cursoragent@cursor.com>
</commit_message>
<xml_diff>
--- a/resume/Shrey_Resume_Business_Strategy_Analyst.docx
+++ b/resume/Shrey_Resume_Business_Strategy_Analyst.docx
@@ -36,7 +36,55 @@
           <w:sz w:val="19"/>
           <w:szCs w:val="19"/>
         </w:rPr>
-        <w:t xml:space="preserve">Boston, MA  •  857-364-1539  •  shirke.sh@northeastern.edu  •  </w:t>
+        <w:t xml:space="preserve">Boston, </w:t>
+      </w:r>
+      <w:proofErr w:type="gramStart"/>
+      <w:r>
+        <w:rPr>
+          <w:sz w:val="19"/>
+          <w:szCs w:val="19"/>
+        </w:rPr>
+        <w:t>MA  •</w:t>
+      </w:r>
+      <w:proofErr w:type="gramEnd"/>
+      <w:r>
+        <w:rPr>
+          <w:sz w:val="19"/>
+          <w:szCs w:val="19"/>
+        </w:rPr>
+        <w:t xml:space="preserve">  857-364-</w:t>
+      </w:r>
+      <w:proofErr w:type="gramStart"/>
+      <w:r>
+        <w:rPr>
+          <w:sz w:val="19"/>
+          <w:szCs w:val="19"/>
+        </w:rPr>
+        <w:t>1539  •</w:t>
+      </w:r>
+      <w:proofErr w:type="gramEnd"/>
+      <w:r>
+        <w:rPr>
+          <w:sz w:val="19"/>
+          <w:szCs w:val="19"/>
+        </w:rPr>
+        <w:t xml:space="preserve">  </w:t>
+      </w:r>
+      <w:proofErr w:type="gramStart"/>
+      <w:r>
+        <w:rPr>
+          <w:sz w:val="19"/>
+          <w:szCs w:val="19"/>
+        </w:rPr>
+        <w:t>shirke.sh@northeastern.edu  •</w:t>
+      </w:r>
+      <w:proofErr w:type="gramEnd"/>
+      <w:r>
+        <w:rPr>
+          <w:sz w:val="19"/>
+          <w:szCs w:val="19"/>
+        </w:rPr>
+        <w:t xml:space="preserve">  </w:t>
       </w:r>
       <w:hyperlink r:id="rId5" w:history="1">
         <w:r>
@@ -126,16 +174,15 @@
         <w:spacing w:after="50"/>
       </w:pPr>
       <w:r>
-        <w:t>Business and strategy analyst completing an M.S. in Project Management at Northeastern, with a Business Analysis concentration.</w:t>
-      </w:r>
-      <w:r>
-        <w:t xml:space="preserve"> </w:t>
-      </w:r>
-      <w:r>
-        <w:t>Skilled in stakeholder reporting, process improvement, and design governance on AI product teams.</w:t>
-      </w:r>
-      <w:r>
-        <w:t xml:space="preserve"> </w:t>
+        <w:t xml:space="preserve">Business and strategy analyst with experience supporting cross-functional initiatives across AI product development and operations. Skilled in requirements gathering (BRDs), stakeholder management, process improvement, gap analysis, and dashboard reporting, with a record of driving operational efficiency and closing measurable performance gaps. National-level sprinter and Northeastern </w:t>
+      </w:r>
+      <w:proofErr w:type="gramStart"/>
+      <w:r>
+        <w:t>athlete</w:t>
+      </w:r>
+      <w:proofErr w:type="gramEnd"/>
+      <w:r>
+        <w:t xml:space="preserve"> recognized for discipline, resilience, and high-performance execution in demanding environments.</w:t>
       </w:r>
     </w:p>
     <w:p>
@@ -335,10 +382,7 @@
         <w:t>8</w:t>
       </w:r>
       <w:r>
-        <w:t xml:space="preserve">+ engineers, designers, and PMs, </w:t>
-      </w:r>
-      <w:r>
-        <w:t>across six AI products over a six-month co-op, ensuring alignment on priorities, blockers, and delivery timelines.</w:t>
+        <w:t>+ engineers, designers, and PMs, ensuring alignment and on-time delivery across six concurrent AI products.</w:t>
       </w:r>
     </w:p>
     <w:p>
@@ -390,10 +434,7 @@
         <w:spacing w:after="14"/>
       </w:pPr>
       <w:r>
-        <w:t xml:space="preserve">Partnered with senior leadership to implement a tokenized design system spanning Notion, GitHub, Figma, and production code, </w:t>
-      </w:r>
-      <w:r>
-        <w:t>establishing a single source of truth for design consistency across active products</w:t>
+        <w:t>Partnered with senior leadership to implement a tokenized design system spanning Notion, GitHub, Figma, and production code, improving design consistency and increasing compliance scores from 85% to 92%</w:t>
       </w:r>
       <w:r>
         <w:t>.</w:t>
@@ -405,13 +446,61 @@
           <w:bottom w:val="single" w:sz="6" w:space="1" w:color="000000"/>
         </w:pBdr>
         <w:spacing w:before="100" w:after="30"/>
+      </w:pPr>
+      <w:r>
         <w:rPr>
           <w:b/>
           <w:bCs/>
           <w:sz w:val="24"/>
           <w:szCs w:val="24"/>
         </w:rPr>
-      </w:pPr>
+        <w:t>TECHNICAL SKILLS</w:t>
+      </w:r>
+    </w:p>
+    <w:p>
+      <w:pPr>
+        <w:spacing w:after="40"/>
+      </w:pPr>
+      <w:r>
+        <w:rPr>
+          <w:b/>
+          <w:bCs/>
+        </w:rPr>
+        <w:t xml:space="preserve">Core Competencies: </w:t>
+      </w:r>
+      <w:r>
+        <w:t>Business Analysis, Requirements Gathering (BRDs), Stakeholder Management, Process Improvement, Strategic Planning, Gap Analysis, Root Cause Analysis, Process Mapping, Workflow Design, UAT, Dashboard Development, Data Analysis</w:t>
+      </w:r>
+    </w:p>
+    <w:p>
+      <w:pPr>
+        <w:spacing w:after="40"/>
+      </w:pPr>
+      <w:r>
+        <w:rPr>
+          <w:b/>
+          <w:bCs/>
+        </w:rPr>
+        <w:t xml:space="preserve">Methodologies: </w:t>
+      </w:r>
+      <w:r>
+        <w:t>SDLC, Change Control, Sprint Planning, Waterfall, RACI, OKRs, KPIs</w:t>
+      </w:r>
+    </w:p>
+    <w:p>
+      <w:pPr>
+        <w:spacing w:after="40"/>
+      </w:pPr>
+      <w:r>
+        <w:rPr>
+          <w:b/>
+          <w:bCs/>
+        </w:rPr>
+        <w:t xml:space="preserve">Tools/Platforms: </w:t>
+      </w:r>
+      <w:r>
+        <w:t>MS Excel, MS Project, Primavera, Notion, Figma, MS PowerPoint, Claude Design, Stitch</w:t>
+      </w:r>
     </w:p>
     <w:p>
       <w:pPr>
@@ -419,367 +508,14 @@
           <w:bottom w:val="single" w:sz="6" w:space="1" w:color="000000"/>
         </w:pBdr>
         <w:spacing w:before="100" w:after="30"/>
+      </w:pPr>
+      <w:r>
         <w:rPr>
           <w:b/>
           <w:bCs/>
           <w:sz w:val="24"/>
           <w:szCs w:val="24"/>
         </w:rPr>
-      </w:pPr>
-    </w:p>
-    <w:p>
-      <w:pPr>
-        <w:pBdr>
-          <w:bottom w:val="single" w:sz="6" w:space="1" w:color="000000"/>
-        </w:pBdr>
-        <w:spacing w:before="100" w:after="30"/>
-        <w:rPr>
-          <w:b/>
-          <w:bCs/>
-          <w:sz w:val="24"/>
-          <w:szCs w:val="24"/>
-        </w:rPr>
-      </w:pPr>
-      <w:r>
-        <w:rPr>
-          <w:b/>
-          <w:bCs/>
-          <w:sz w:val="24"/>
-          <w:szCs w:val="24"/>
-        </w:rPr>
-        <w:t>Athletics Facilities Staff</w:t>
-      </w:r>
-    </w:p>
-    <w:p>
-      <w:pPr>
-        <w:pBdr>
-          <w:bottom w:val="single" w:sz="6" w:space="1" w:color="000000"/>
-        </w:pBdr>
-        <w:spacing w:before="100" w:after="30"/>
-        <w:rPr>
-          <w:b/>
-          <w:bCs/>
-          <w:sz w:val="24"/>
-          <w:szCs w:val="24"/>
-        </w:rPr>
-      </w:pPr>
-      <w:r>
-        <w:rPr>
-          <w:b/>
-          <w:bCs/>
-          <w:sz w:val="24"/>
-          <w:szCs w:val="24"/>
-        </w:rPr>
-        <w:t>Dec 2025 - Present</w:t>
-      </w:r>
-    </w:p>
-    <w:p>
-      <w:pPr>
-        <w:pBdr>
-          <w:bottom w:val="single" w:sz="6" w:space="1" w:color="000000"/>
-        </w:pBdr>
-        <w:spacing w:before="100" w:after="30"/>
-        <w:rPr>
-          <w:b/>
-          <w:bCs/>
-          <w:sz w:val="24"/>
-          <w:szCs w:val="24"/>
-        </w:rPr>
-      </w:pPr>
-      <w:r>
-        <w:rPr>
-          <w:b/>
-          <w:bCs/>
-          <w:sz w:val="24"/>
-          <w:szCs w:val="24"/>
-        </w:rPr>
-        <w:t>Northeastern University Athletics | Boston, MA</w:t>
-      </w:r>
-    </w:p>
-    <w:p>
-      <w:pPr>
-        <w:pBdr>
-          <w:bottom w:val="single" w:sz="6" w:space="1" w:color="000000"/>
-        </w:pBdr>
-        <w:spacing w:before="100" w:after="30"/>
-        <w:rPr>
-          <w:b/>
-          <w:bCs/>
-          <w:sz w:val="24"/>
-          <w:szCs w:val="24"/>
-        </w:rPr>
-      </w:pPr>
-      <w:r>
-        <w:rPr>
-          <w:b/>
-          <w:bCs/>
-          <w:sz w:val="24"/>
-          <w:szCs w:val="24"/>
-        </w:rPr>
-        <w:t>Supported game-day operations for varsity events.</w:t>
-      </w:r>
-    </w:p>
-    <w:p>
-      <w:pPr>
-        <w:pBdr>
-          <w:bottom w:val="single" w:sz="6" w:space="1" w:color="000000"/>
-        </w:pBdr>
-        <w:spacing w:before="100" w:after="30"/>
-        <w:rPr>
-          <w:b/>
-          <w:bCs/>
-          <w:sz w:val="24"/>
-          <w:szCs w:val="24"/>
-        </w:rPr>
-      </w:pPr>
-      <w:r>
-        <w:rPr>
-          <w:b/>
-          <w:bCs/>
-          <w:sz w:val="24"/>
-          <w:szCs w:val="24"/>
-        </w:rPr>
-        <w:t>Coordinated event setup, crowd flow, and operational support.</w:t>
-      </w:r>
-    </w:p>
-    <w:p>
-      <w:pPr>
-        <w:pBdr>
-          <w:bottom w:val="single" w:sz="6" w:space="1" w:color="000000"/>
-        </w:pBdr>
-        <w:spacing w:before="100" w:after="30"/>
-        <w:rPr>
-          <w:b/>
-          <w:bCs/>
-          <w:sz w:val="24"/>
-          <w:szCs w:val="24"/>
-        </w:rPr>
-      </w:pPr>
-      <w:r>
-        <w:rPr>
-          <w:b/>
-          <w:bCs/>
-          <w:sz w:val="24"/>
-          <w:szCs w:val="24"/>
-        </w:rPr>
-        <w:t>Assisted daily facility operations and customer service.</w:t>
-      </w:r>
-    </w:p>
-    <w:p>
-      <w:pPr>
-        <w:pBdr>
-          <w:bottom w:val="single" w:sz="6" w:space="1" w:color="000000"/>
-        </w:pBdr>
-        <w:spacing w:before="100" w:after="30"/>
-        <w:rPr>
-          <w:b/>
-          <w:bCs/>
-          <w:sz w:val="24"/>
-          <w:szCs w:val="24"/>
-        </w:rPr>
-      </w:pPr>
-    </w:p>
-    <w:p>
-      <w:pPr>
-        <w:pBdr>
-          <w:bottom w:val="single" w:sz="6" w:space="1" w:color="000000"/>
-        </w:pBdr>
-        <w:spacing w:before="100" w:after="30"/>
-        <w:rPr>
-          <w:b/>
-          <w:bCs/>
-          <w:sz w:val="24"/>
-          <w:szCs w:val="24"/>
-        </w:rPr>
-      </w:pPr>
-      <w:r>
-        <w:rPr>
-          <w:b/>
-          <w:bCs/>
-          <w:sz w:val="24"/>
-          <w:szCs w:val="24"/>
-        </w:rPr>
-        <w:t>RSO Proctor</w:t>
-      </w:r>
-    </w:p>
-    <w:p>
-      <w:pPr>
-        <w:pBdr>
-          <w:bottom w:val="single" w:sz="6" w:space="1" w:color="000000"/>
-        </w:pBdr>
-        <w:spacing w:before="100" w:after="30"/>
-        <w:rPr>
-          <w:b/>
-          <w:bCs/>
-          <w:sz w:val="24"/>
-          <w:szCs w:val="24"/>
-        </w:rPr>
-      </w:pPr>
-      <w:r>
-        <w:rPr>
-          <w:b/>
-          <w:bCs/>
-          <w:sz w:val="24"/>
-          <w:szCs w:val="24"/>
-        </w:rPr>
-        <w:t>Dec 2025 - Present</w:t>
-      </w:r>
-    </w:p>
-    <w:p>
-      <w:pPr>
-        <w:pBdr>
-          <w:bottom w:val="single" w:sz="6" w:space="1" w:color="000000"/>
-        </w:pBdr>
-        <w:spacing w:before="100" w:after="30"/>
-        <w:rPr>
-          <w:b/>
-          <w:bCs/>
-          <w:sz w:val="24"/>
-          <w:szCs w:val="24"/>
-        </w:rPr>
-      </w:pPr>
-      <w:r>
-        <w:rPr>
-          <w:b/>
-          <w:bCs/>
-          <w:sz w:val="24"/>
-          <w:szCs w:val="24"/>
-        </w:rPr>
-        <w:t>Northeastern University | Boston, MA</w:t>
-      </w:r>
-    </w:p>
-    <w:p>
-      <w:pPr>
-        <w:pBdr>
-          <w:bottom w:val="single" w:sz="6" w:space="1" w:color="000000"/>
-        </w:pBdr>
-        <w:spacing w:before="100" w:after="30"/>
-        <w:rPr>
-          <w:b/>
-          <w:bCs/>
-          <w:sz w:val="24"/>
-          <w:szCs w:val="24"/>
-        </w:rPr>
-      </w:pPr>
-      <w:r>
-        <w:rPr>
-          <w:b/>
-          <w:bCs/>
-          <w:sz w:val="24"/>
-          <w:szCs w:val="24"/>
-        </w:rPr>
-        <w:t>Monitored residence hall access and verified entry.</w:t>
-      </w:r>
-    </w:p>
-    <w:p>
-      <w:pPr>
-        <w:pBdr>
-          <w:bottom w:val="single" w:sz="6" w:space="1" w:color="000000"/>
-        </w:pBdr>
-        <w:spacing w:before="100" w:after="30"/>
-        <w:rPr>
-          <w:b/>
-          <w:bCs/>
-          <w:sz w:val="24"/>
-          <w:szCs w:val="24"/>
-        </w:rPr>
-      </w:pPr>
-      <w:r>
-        <w:rPr>
-          <w:b/>
-          <w:bCs/>
-          <w:sz w:val="24"/>
-          <w:szCs w:val="24"/>
-        </w:rPr>
-        <w:t>Assisted check-ins, visitor management, and front-desk operations.</w:t>
-      </w:r>
-    </w:p>
-    <w:p>
-      <w:pPr>
-        <w:pBdr>
-          <w:bottom w:val="single" w:sz="6" w:space="1" w:color="000000"/>
-        </w:pBdr>
-        <w:spacing w:before="100" w:after="30"/>
-      </w:pPr>
-      <w:r>
-        <w:rPr>
-          <w:b/>
-          <w:bCs/>
-          <w:sz w:val="24"/>
-          <w:szCs w:val="24"/>
-        </w:rPr>
-        <w:t>Supported housing policies and incident reporting.</w:t>
-      </w:r>
-      <w:r>
-        <w:rPr>
-          <w:b/>
-          <w:bCs/>
-          <w:sz w:val="24"/>
-          <w:szCs w:val="24"/>
-        </w:rPr>
-        <w:t>TECHNICAL SKILLS</w:t>
-      </w:r>
-    </w:p>
-    <w:p>
-      <w:pPr>
-        <w:spacing w:after="40"/>
-      </w:pPr>
-      <w:r>
-        <w:rPr>
-          <w:b/>
-          <w:bCs/>
-        </w:rPr>
-        <w:t xml:space="preserve">Core Competencies: </w:t>
-      </w:r>
-      <w:r>
-        <w:t>Business Analysis, Requirements Gathering (BRDs), Stakeholder Management, Process Improvement, Strategic Planning, Gap Analysis, Root Cause Analysis, Process Mapping, Workflow Design, UAT, Dashboard Development, Data Analysis</w:t>
-      </w:r>
-    </w:p>
-    <w:p>
-      <w:pPr>
-        <w:spacing w:after="40"/>
-      </w:pPr>
-      <w:r>
-        <w:rPr>
-          <w:b/>
-          <w:bCs/>
-        </w:rPr>
-        <w:lastRenderedPageBreak/>
-        <w:t xml:space="preserve">Methodologies: </w:t>
-      </w:r>
-      <w:r>
-        <w:t>SDLC, Change Control, Sprint Planning, Waterfall, RACI, OKRs, KPIs</w:t>
-      </w:r>
-    </w:p>
-    <w:p>
-      <w:pPr>
-        <w:spacing w:after="40"/>
-      </w:pPr>
-      <w:r>
-        <w:rPr>
-          <w:b/>
-          <w:bCs/>
-        </w:rPr>
-        <w:t xml:space="preserve">Tools/Platforms: </w:t>
-      </w:r>
-      <w:r>
-        <w:t>MS Excel, MS Project, Primavera, Notion, Figma, MS PowerPoint, Claude Design, Stitch</w:t>
-      </w:r>
-    </w:p>
-    <w:p>
-      <w:pPr>
-        <w:pBdr>
-          <w:bottom w:val="single" w:sz="6" w:space="1" w:color="000000"/>
-        </w:pBdr>
-        <w:spacing w:before="100" w:after="30"/>
-      </w:pPr>
-      <w:r>
-        <w:rPr>
-          <w:b/>
-          <w:bCs/>
-          <w:sz w:val="24"/>
-          <w:szCs w:val="24"/>
-        </w:rPr>
         <w:t>PROJECTS</w:t>
       </w:r>
     </w:p>
@@ -814,7 +550,32 @@
           <w:i/>
           <w:iCs/>
         </w:rPr>
-        <w:t>Notion, GitHub, CSS/Tokens (aosenuma.tokens.json)</w:t>
+        <w:t>Notion, GitHub, CSS/Tokens (</w:t>
+      </w:r>
+      <w:proofErr w:type="spellStart"/>
+      <w:proofErr w:type="gramStart"/>
+      <w:r>
+        <w:rPr>
+          <w:i/>
+          <w:iCs/>
+        </w:rPr>
+        <w:t>aosenuma.tokens</w:t>
+      </w:r>
+      <w:proofErr w:type="gramEnd"/>
+      <w:r>
+        <w:rPr>
+          <w:i/>
+          <w:iCs/>
+        </w:rPr>
+        <w:t>.json</w:t>
+      </w:r>
+      <w:proofErr w:type="spellEnd"/>
+      <w:r>
+        <w:rPr>
+          <w:i/>
+          <w:iCs/>
+        </w:rPr>
+        <w:t>)</w:t>
       </w:r>
       <w:r>
         <w:rPr>
@@ -834,7 +595,7 @@
         <w:spacing w:after="14"/>
       </w:pPr>
       <w:r>
-        <w:t>Five active AI products used conflicting style guides. Defined requirements for one tokenized design system, synchronized across Notion, GitHub, and code.</w:t>
+        <w:t>Defined requirements and governance standards for a company-wide design system, including design tokens, semantic color palettes, accessibility guidelines, and component specifications, documented in a machine-readable framework synchronized across Notion, GitHub, and code.</w:t>
       </w:r>
     </w:p>
     <w:p>
@@ -847,13 +608,7 @@
         <w:spacing w:after="14"/>
       </w:pPr>
       <w:r>
-        <w:t>Ran compliance reviews across product prototypes,</w:t>
-      </w:r>
-      <w:r>
-        <w:t xml:space="preserve"> </w:t>
-      </w:r>
-      <w:r>
-        <w:t>conducting gap analyses; closed a 7-point compliance gap (85% to 92%).</w:t>
+        <w:t>Established compliance review processes and evidence-based audit requirements across all AI products and product prototypes, conducting gap analyses that increased design system compliance from 85% to 92% and helped create a single source of truth adopted across active product initiatives.</w:t>
       </w:r>
     </w:p>
     <w:p>
@@ -885,13 +640,29 @@
           <w:b/>
           <w:bCs/>
         </w:rPr>
-        <w:t>Northeastern Club Running (NUCR) — Sprinter, Track &amp; Field</w:t>
+        <w:t>Northeastern Club Running (</w:t>
+      </w:r>
+      <w:proofErr w:type="gramStart"/>
+      <w:r>
+        <w:rPr>
+          <w:b/>
+          <w:bCs/>
+        </w:rPr>
+        <w:t>NUCR) —</w:t>
+      </w:r>
+      <w:proofErr w:type="gramEnd"/>
+      <w:r>
+        <w:rPr>
+          <w:b/>
+          <w:bCs/>
+        </w:rPr>
+        <w:t xml:space="preserve"> Sprinter, Track &amp; Field</w:t>
       </w:r>
       <w:r>
         <w:tab/>
       </w:r>
       <w:r>
-        <w:t>Sept 2024 - Present</w:t>
+        <w:t>Sept 2024 - Current</w:t>
       </w:r>
     </w:p>
     <w:p>
@@ -927,7 +698,7 @@
         <w:spacing w:after="14"/>
       </w:pPr>
       <w:r>
-        <w:t>Compete in sprint and relay events at regional, state, and national NIRCA (club collegiate running) meets. Ranked among the Top 20 athletes in NIRCA for sprinting and relay performance. Competed in sprint events in India before grad school.</w:t>
+        <w:t>Compete for Northeastern University at regional, city, and state-level track and field competitions, demonstrating discipline, teamwork, and high-performance execution.</w:t>
       </w:r>
     </w:p>
     <w:p>
@@ -939,6 +710,9 @@
         </w:numPr>
         <w:spacing w:after="14"/>
       </w:pPr>
+      <w:r>
+        <w:t>Support university and community sporting events at Northeastern Athletics Facilities, assisting with event logistics and operations.</w:t>
+      </w:r>
     </w:p>
     <w:sectPr>
       <w:pgSz w:w="12240" w:h="15840"/>
@@ -1589,7 +1363,6 @@
   <w:style w:type="character" w:default="1" w:styleId="DefaultParagraphFont">
     <w:name w:val="Default Paragraph Font"/>
     <w:uiPriority w:val="1"/>
-    <w:semiHidden/>
     <w:unhideWhenUsed/>
   </w:style>
   <w:style w:type="table" w:default="1" w:styleId="TableNormal">

</xml_diff>

<commit_message>
Update resume from latest local DOCX and regenerate PDF.
</commit_message>
<xml_diff>
--- a/resume/Shrey_Resume_Business_Strategy_Analyst.docx
+++ b/resume/Shrey_Resume_Business_Strategy_Analyst.docx
@@ -14,16 +14,7 @@
           <w:sz w:val="34"/>
           <w:szCs w:val="34"/>
         </w:rPr>
-        <w:t>Shrey</w:t>
-      </w:r>
-      <w:r>
-        <w:rPr>
-          <w:b/>
-          <w:bCs/>
-          <w:sz w:val="34"/>
-          <w:szCs w:val="34"/>
-        </w:rPr>
-        <w:t>as Shirke</w:t>
+        <w:t>Shreyas Shirke</w:t>
       </w:r>
     </w:p>
     <w:p>
@@ -36,55 +27,7 @@
           <w:sz w:val="19"/>
           <w:szCs w:val="19"/>
         </w:rPr>
-        <w:t xml:space="preserve">Boston, </w:t>
-      </w:r>
-      <w:proofErr w:type="gramStart"/>
-      <w:r>
-        <w:rPr>
-          <w:sz w:val="19"/>
-          <w:szCs w:val="19"/>
-        </w:rPr>
-        <w:t>MA  •</w:t>
-      </w:r>
-      <w:proofErr w:type="gramEnd"/>
-      <w:r>
-        <w:rPr>
-          <w:sz w:val="19"/>
-          <w:szCs w:val="19"/>
-        </w:rPr>
-        <w:t xml:space="preserve">  857-364-</w:t>
-      </w:r>
-      <w:proofErr w:type="gramStart"/>
-      <w:r>
-        <w:rPr>
-          <w:sz w:val="19"/>
-          <w:szCs w:val="19"/>
-        </w:rPr>
-        <w:t>1539  •</w:t>
-      </w:r>
-      <w:proofErr w:type="gramEnd"/>
-      <w:r>
-        <w:rPr>
-          <w:sz w:val="19"/>
-          <w:szCs w:val="19"/>
-        </w:rPr>
-        <w:t xml:space="preserve">  </w:t>
-      </w:r>
-      <w:proofErr w:type="gramStart"/>
-      <w:r>
-        <w:rPr>
-          <w:sz w:val="19"/>
-          <w:szCs w:val="19"/>
-        </w:rPr>
-        <w:t>shirke.sh@northeastern.edu  •</w:t>
-      </w:r>
-      <w:proofErr w:type="gramEnd"/>
-      <w:r>
-        <w:rPr>
-          <w:sz w:val="19"/>
-          <w:szCs w:val="19"/>
-        </w:rPr>
-        <w:t xml:space="preserve">  </w:t>
+        <w:t xml:space="preserve">Boston, MA  •  857-364-1539  •  shirke.sh@northeastern.edu  •  </w:t>
       </w:r>
       <w:hyperlink r:id="rId5" w:history="1">
         <w:r>
@@ -101,21 +44,7 @@
           <w:sz w:val="19"/>
           <w:szCs w:val="19"/>
         </w:rPr>
-        <w:t xml:space="preserve">  </w:t>
-      </w:r>
-      <w:r>
-        <w:rPr>
-          <w:sz w:val="19"/>
-          <w:szCs w:val="19"/>
-        </w:rPr>
-        <w:t>•</w:t>
-      </w:r>
-      <w:r>
-        <w:rPr>
-          <w:sz w:val="19"/>
-          <w:szCs w:val="19"/>
-        </w:rPr>
-        <w:t xml:space="preserve">  </w:t>
+        <w:t xml:space="preserve">  •  </w:t>
       </w:r>
       <w:hyperlink r:id="rId6" w:history="1">
         <w:r>
@@ -132,14 +61,7 @@
           <w:sz w:val="19"/>
           <w:szCs w:val="19"/>
         </w:rPr>
-        <w:t xml:space="preserve">  </w:t>
-      </w:r>
-      <w:r>
-        <w:rPr>
-          <w:sz w:val="19"/>
-          <w:szCs w:val="19"/>
-        </w:rPr>
-        <w:t xml:space="preserve">•  </w:t>
+        <w:t xml:space="preserve">  •  </w:t>
       </w:r>
       <w:hyperlink r:id="rId7" w:history="1">
         <w:r>
@@ -174,15 +96,7 @@
         <w:spacing w:after="50"/>
       </w:pPr>
       <w:r>
-        <w:t xml:space="preserve">Business and strategy analyst with experience supporting cross-functional initiatives across AI product development and operations. Skilled in requirements gathering (BRDs), stakeholder management, process improvement, gap analysis, and dashboard reporting, with a record of driving operational efficiency and closing measurable performance gaps. National-level sprinter and Northeastern </w:t>
-      </w:r>
-      <w:proofErr w:type="gramStart"/>
-      <w:r>
-        <w:t>athlete</w:t>
-      </w:r>
-      <w:proofErr w:type="gramEnd"/>
-      <w:r>
-        <w:t xml:space="preserve"> recognized for discipline, resilience, and high-performance execution in demanding environments.</w:t>
+        <w:t>Business and strategy analyst with experience supporting cross-functional initiatives across AI product development and operations. Skilled in requirements gathering (BRDs), stakeholder management, process improvement, gap analysis, and dashboard reporting, with a record of driving operational efficiency and closing measurable performance gaps. National-level sprinter and Northeastern athlete recognized for discipline, resilience, and high-performance execution in demanding environments.</w:t>
       </w:r>
     </w:p>
     <w:p>
@@ -205,7 +119,7 @@
     <w:p>
       <w:pPr>
         <w:tabs>
-          <w:tab w:val="right" w:pos="10224"/>
+          <w:tab w:val="right" w:pos="11057"/>
         </w:tabs>
         <w:spacing w:before="60"/>
       </w:pPr>
@@ -224,7 +138,7 @@
     <w:p>
       <w:pPr>
         <w:tabs>
-          <w:tab w:val="right" w:pos="10224"/>
+          <w:tab w:val="right" w:pos="11057"/>
         </w:tabs>
         <w:spacing w:after="50"/>
       </w:pPr>
@@ -234,12 +148,6 @@
           <w:iCs/>
         </w:rPr>
         <w:t>Northeastern University</w:t>
-      </w:r>
-      <w:r>
-        <w:rPr>
-          <w:i/>
-          <w:iCs/>
-        </w:rPr>
         <w:tab/>
         <w:t>Boston, MA</w:t>
       </w:r>
@@ -254,58 +162,43 @@
         <w:spacing w:after="14"/>
       </w:pPr>
       <w:r>
-        <w:t xml:space="preserve">Relevant Coursework: </w:t>
-      </w:r>
-      <w:r>
-        <w:t>Foundations of Project Management</w:t>
-      </w:r>
-      <w:r>
-        <w:t xml:space="preserve">, </w:t>
-      </w:r>
-      <w:r>
-        <w:t>Schedule, and Cost Mgt.</w:t>
-      </w:r>
-      <w:r>
-        <w:t xml:space="preserve">, </w:t>
-      </w:r>
-      <w:r>
-        <w:t>Project Risk Management</w:t>
-      </w:r>
-      <w:r>
-        <w:t xml:space="preserve">, </w:t>
-      </w:r>
-      <w:r>
-        <w:t>Project Finance</w:t>
-      </w:r>
-      <w:r>
-        <w:t xml:space="preserve">, </w:t>
-      </w:r>
-      <w:r>
-        <w:t>Project Quality Management</w:t>
-      </w:r>
-      <w:r>
-        <w:t xml:space="preserve">, </w:t>
-      </w:r>
-      <w:r>
-        <w:t>Foundations of Project Business Analysis</w:t>
-      </w:r>
-      <w:r>
-        <w:t xml:space="preserve">, </w:t>
-      </w:r>
-      <w:r>
-        <w:t>Product Requirements Design and Ownership</w:t>
-      </w:r>
-      <w:r>
-        <w:t xml:space="preserve">, </w:t>
-      </w:r>
-      <w:r>
-        <w:t>Quant. and Qual. Methods for Bus. Analysis</w:t>
-      </w:r>
-      <w:r>
-        <w:t xml:space="preserve">, </w:t>
-      </w:r>
-      <w:r>
-        <w:t>Advanced Seminar in Business Analysis</w:t>
+        <w:t>Relevant Coursework: Foundations of Project Management, Foundations of Project Business Analysis, Product Requirements Design and Ownership, Quant. and Qual. Methods for Bus. Analysis</w:t>
+      </w:r>
+    </w:p>
+    <w:p>
+      <w:pPr>
+        <w:tabs>
+          <w:tab w:val="right" w:pos="11057"/>
+        </w:tabs>
+        <w:spacing w:before="60"/>
+      </w:pPr>
+      <w:r>
+        <w:rPr>
+          <w:b/>
+          <w:bCs/>
+        </w:rPr>
+        <w:t>Bachelor of Science, Information Technology</w:t>
+      </w:r>
+      <w:r>
+        <w:tab/>
+        <w:t>July 2019 – Apr 2022</w:t>
+      </w:r>
+    </w:p>
+    <w:p>
+      <w:pPr>
+        <w:tabs>
+          <w:tab w:val="right" w:pos="11057"/>
+        </w:tabs>
+        <w:spacing w:after="50"/>
+      </w:pPr>
+      <w:r>
+        <w:rPr>
+          <w:i/>
+          <w:iCs/>
+        </w:rPr>
+        <w:t>MSG-SGKM College of Science, Arts, and Commerce, Mumbai University</w:t>
+        <w:tab/>
+        <w:t>Mumbai, IND</w:t>
       </w:r>
     </w:p>
     <w:p>
@@ -328,7 +221,7 @@
     <w:p>
       <w:pPr>
         <w:tabs>
-          <w:tab w:val="right" w:pos="10224"/>
+          <w:tab w:val="right" w:pos="11057"/>
         </w:tabs>
         <w:spacing w:before="60"/>
       </w:pPr>
@@ -357,12 +250,6 @@
           <w:iCs/>
         </w:rPr>
         <w:t>Aosenuma.ai</w:t>
-      </w:r>
-      <w:r>
-        <w:rPr>
-          <w:i/>
-          <w:iCs/>
-        </w:rPr>
         <w:tab/>
       </w:r>
     </w:p>
@@ -376,13 +263,34 @@
         <w:spacing w:after="14"/>
       </w:pPr>
       <w:r>
-        <w:t>Coordinated daily standups and sprint tracking for a cross-functional team of 1</w:t>
-      </w:r>
-      <w:r>
-        <w:t>8</w:t>
-      </w:r>
-      <w:r>
-        <w:t>+ engineers, designers, and PMs, ensuring alignment and on-time delivery across six concurrent AI products.</w:t>
+        <w:rPr>
+          <w:b/>
+          <w:bCs/>
+        </w:rPr>
+        <w:t>Published</w:t>
+      </w:r>
+      <w:r>
+        <w:t xml:space="preserve"> the Steward Daily Compliance Report across a </w:t>
+      </w:r>
+      <w:r>
+        <w:rPr>
+          <w:b/>
+          <w:bCs/>
+        </w:rPr>
+        <w:t>150-entry RAD log</w:t>
+      </w:r>
+      <w:r>
+        <w:t xml:space="preserve">, resulting in </w:t>
+      </w:r>
+      <w:r>
+        <w:rPr>
+          <w:b/>
+          <w:bCs/>
+        </w:rPr>
+        <w:t>~30% fewer stale entries</w:t>
+      </w:r>
+      <w:r>
+        <w:t xml:space="preserve"> during stewardship weeks.</w:t>
       </w:r>
     </w:p>
     <w:p>
@@ -395,7 +303,34 @@
         <w:spacing w:after="14"/>
       </w:pPr>
       <w:r>
-        <w:t>Designed and validated UI/UX prototypes for multiple AI initiatives, including Stake AI and a WhatsApp Summary Bot, using Stitch (Google), Claude Design, and Cursor. Developed experimental prototypes to evaluate and refine Design.md standards and UI/UX guidelines.</w:t>
+        <w:rPr>
+          <w:b/>
+          <w:bCs/>
+        </w:rPr>
+        <w:t>Drove</w:t>
+      </w:r>
+      <w:r>
+        <w:t xml:space="preserve"> UI/UX governance using a </w:t>
+      </w:r>
+      <w:r>
+        <w:rPr>
+          <w:b/>
+          <w:bCs/>
+        </w:rPr>
+        <w:t>168-point quality checklist</w:t>
+      </w:r>
+      <w:r>
+        <w:t xml:space="preserve">, producing </w:t>
+      </w:r>
+      <w:r>
+        <w:rPr>
+          <w:b/>
+          <w:bCs/>
+        </w:rPr>
+        <w:t>~80% guideline adoption across 5+ audited projects</w:t>
+      </w:r>
+      <w:r>
+        <w:t>.</w:t>
       </w:r>
     </w:p>
     <w:p>
@@ -408,7 +343,14 @@
         <w:spacing w:after="14"/>
       </w:pPr>
       <w:r>
-        <w:t>Accelerated product delivery by translating requirements into development-ready specifications and moving features from planning to implementation within the same sprint cycle.</w:t>
+        <w:rPr>
+          <w:b/>
+          <w:bCs/>
+        </w:rPr>
+        <w:t>Aligned</w:t>
+      </w:r>
+      <w:r>
+        <w:t xml:space="preserve"> portfolio status through weekly PM touchpoints and cadence meetings, keeping scope and priorities in sync across the team.</w:t>
       </w:r>
     </w:p>
     <w:p>
@@ -419,9 +361,116 @@
           <w:numId w:val="2"/>
         </w:numPr>
         <w:spacing w:after="14"/>
-      </w:pPr>
-      <w:r>
-        <w:t>Conducted compliance and design quality audits across AI product prototypes, created detailed scorecards, identified improvement opportunities, and presented executive-level summaries to leadership.</w:t>
+        <w:ind w:left="714" w:hanging="357"/>
+      </w:pPr>
+      <w:r>
+        <w:rPr>
+          <w:b/>
+          <w:bCs/>
+        </w:rPr>
+        <w:t>Tracked</w:t>
+      </w:r>
+      <w:r>
+        <w:t xml:space="preserve"> team capacity and roll-offs to match resources to project demand and prevent over-allocation.  </w:t>
+      </w:r>
+    </w:p>
+    <w:p>
+      <w:pPr>
+        <w:pBdr>
+          <w:bottom w:val="single" w:sz="6" w:space="1" w:color="000000"/>
+        </w:pBdr>
+        <w:spacing w:before="100" w:after="30"/>
+      </w:pPr>
+      <w:r>
+        <w:rPr>
+          <w:b/>
+          <w:bCs/>
+          <w:sz w:val="24"/>
+          <w:szCs w:val="24"/>
+        </w:rPr>
+        <w:t>TECHNICAL SKILLS</w:t>
+      </w:r>
+    </w:p>
+    <w:p>
+      <w:pPr>
+        <w:spacing w:after="40"/>
+      </w:pPr>
+      <w:r>
+        <w:rPr>
+          <w:b/>
+          <w:bCs/>
+        </w:rPr>
+        <w:t xml:space="preserve">Core Competencies: </w:t>
+      </w:r>
+      <w:r>
+        <w:t>Business Analysis, Requirements Gathering (BRDs), Stakeholder Management, Process Improvement, Strategic Planning, Gap Analysis, Root Cause Analysis, Process Mapping, Workflow Design, UAT, Dashboard Development, Data Analysis, Change Control, Sprint Planning</w:t>
+      </w:r>
+    </w:p>
+    <w:p>
+      <w:pPr>
+        <w:spacing w:after="40"/>
+      </w:pPr>
+      <w:r>
+        <w:rPr>
+          <w:b/>
+          <w:bCs/>
+        </w:rPr>
+        <w:t xml:space="preserve">Tools/Platforms: </w:t>
+      </w:r>
+      <w:r>
+        <w:t>MS Excel, MS Project, Primavera, Notion, Figma, MS PowerPoint, Claude Design, Stitch</w:t>
+      </w:r>
+    </w:p>
+    <w:p>
+      <w:pPr>
+        <w:pBdr>
+          <w:bottom w:val="single" w:sz="6" w:space="1" w:color="000000"/>
+        </w:pBdr>
+        <w:spacing w:before="100" w:after="30"/>
+      </w:pPr>
+      <w:r>
+        <w:rPr>
+          <w:b/>
+          <w:bCs/>
+          <w:sz w:val="24"/>
+          <w:szCs w:val="24"/>
+        </w:rPr>
+        <w:t>PROJECTS</w:t>
+      </w:r>
+    </w:p>
+    <w:p>
+      <w:pPr>
+        <w:tabs>
+          <w:tab w:val="right" w:pos="11057"/>
+        </w:tabs>
+        <w:spacing w:before="60"/>
+      </w:pPr>
+      <w:r>
+        <w:rPr>
+          <w:b/>
+          <w:bCs/>
+        </w:rPr>
+        <w:t>UI/UX Guidelines &amp; Design System (design.md)</w:t>
+      </w:r>
+      <w:r>
+        <w:tab/>
+        <w:t>Jan 2026 – Jun 2026</w:t>
+      </w:r>
+    </w:p>
+    <w:p>
+      <w:pPr>
+        <w:tabs>
+          <w:tab w:val="right" w:pos="10224"/>
+        </w:tabs>
+        <w:spacing w:after="50"/>
+      </w:pPr>
+      <w:r>
+        <w:rPr>
+          <w:i/>
+          <w:iCs/>
+        </w:rPr>
+        <w:t>Notion, GitHub, CSS/Tokens (aosenuma.tokens.json)</w:t>
+        <w:tab/>
       </w:r>
     </w:p>
     <w:p>
@@ -434,155 +483,7 @@
         <w:spacing w:after="14"/>
       </w:pPr>
       <w:r>
-        <w:t>Partnered with senior leadership to implement a tokenized design system spanning Notion, GitHub, Figma, and production code, improving design consistency and increasing compliance scores from 85% to 92%</w:t>
-      </w:r>
-      <w:r>
-        <w:t>.</w:t>
-      </w:r>
-    </w:p>
-    <w:p>
-      <w:pPr>
-        <w:pBdr>
-          <w:bottom w:val="single" w:sz="6" w:space="1" w:color="000000"/>
-        </w:pBdr>
-        <w:spacing w:before="100" w:after="30"/>
-      </w:pPr>
-      <w:r>
-        <w:rPr>
-          <w:b/>
-          <w:bCs/>
-          <w:sz w:val="24"/>
-          <w:szCs w:val="24"/>
-        </w:rPr>
-        <w:t>TECHNICAL SKILLS</w:t>
-      </w:r>
-    </w:p>
-    <w:p>
-      <w:pPr>
-        <w:spacing w:after="40"/>
-      </w:pPr>
-      <w:r>
-        <w:rPr>
-          <w:b/>
-          <w:bCs/>
-        </w:rPr>
-        <w:t xml:space="preserve">Core Competencies: </w:t>
-      </w:r>
-      <w:r>
-        <w:t>Business Analysis, Requirements Gathering (BRDs), Stakeholder Management, Process Improvement, Strategic Planning, Gap Analysis, Root Cause Analysis, Process Mapping, Workflow Design, UAT, Dashboard Development, Data Analysis</w:t>
-      </w:r>
-    </w:p>
-    <w:p>
-      <w:pPr>
-        <w:spacing w:after="40"/>
-      </w:pPr>
-      <w:r>
-        <w:rPr>
-          <w:b/>
-          <w:bCs/>
-        </w:rPr>
-        <w:t xml:space="preserve">Methodologies: </w:t>
-      </w:r>
-      <w:r>
-        <w:t>SDLC, Change Control, Sprint Planning, Waterfall, RACI, OKRs, KPIs</w:t>
-      </w:r>
-    </w:p>
-    <w:p>
-      <w:pPr>
-        <w:spacing w:after="40"/>
-      </w:pPr>
-      <w:r>
-        <w:rPr>
-          <w:b/>
-          <w:bCs/>
-        </w:rPr>
-        <w:t xml:space="preserve">Tools/Platforms: </w:t>
-      </w:r>
-      <w:r>
-        <w:t>MS Excel, MS Project, Primavera, Notion, Figma, MS PowerPoint, Claude Design, Stitch</w:t>
-      </w:r>
-    </w:p>
-    <w:p>
-      <w:pPr>
-        <w:pBdr>
-          <w:bottom w:val="single" w:sz="6" w:space="1" w:color="000000"/>
-        </w:pBdr>
-        <w:spacing w:before="100" w:after="30"/>
-      </w:pPr>
-      <w:r>
-        <w:rPr>
-          <w:b/>
-          <w:bCs/>
-          <w:sz w:val="24"/>
-          <w:szCs w:val="24"/>
-        </w:rPr>
-        <w:t>PROJECTS</w:t>
-      </w:r>
-    </w:p>
-    <w:p>
-      <w:pPr>
-        <w:tabs>
-          <w:tab w:val="right" w:pos="10224"/>
-        </w:tabs>
-        <w:spacing w:before="60"/>
-      </w:pPr>
-      <w:r>
-        <w:rPr>
-          <w:b/>
-          <w:bCs/>
-        </w:rPr>
-        <w:t>UI/UX Guidelines &amp; Design System (design.md)</w:t>
-      </w:r>
-      <w:r>
-        <w:tab/>
-        <w:t>Jan 2026 – Jun 2026</w:t>
-      </w:r>
-    </w:p>
-    <w:p>
-      <w:pPr>
-        <w:tabs>
-          <w:tab w:val="right" w:pos="10224"/>
-        </w:tabs>
-        <w:spacing w:after="50"/>
-      </w:pPr>
-      <w:r>
-        <w:rPr>
-          <w:i/>
-          <w:iCs/>
-        </w:rPr>
-        <w:t>Notion, GitHub, CSS/Tokens (</w:t>
-      </w:r>
-      <w:proofErr w:type="spellStart"/>
-      <w:proofErr w:type="gramStart"/>
-      <w:r>
-        <w:rPr>
-          <w:i/>
-          <w:iCs/>
-        </w:rPr>
-        <w:t>aosenuma.tokens</w:t>
-      </w:r>
-      <w:proofErr w:type="gramEnd"/>
-      <w:r>
-        <w:rPr>
-          <w:i/>
-          <w:iCs/>
-        </w:rPr>
-        <w:t>.json</w:t>
-      </w:r>
-      <w:proofErr w:type="spellEnd"/>
-      <w:r>
-        <w:rPr>
-          <w:i/>
-          <w:iCs/>
-        </w:rPr>
-        <w:t>)</w:t>
-      </w:r>
-      <w:r>
-        <w:rPr>
-          <w:i/>
-          <w:iCs/>
-        </w:rPr>
-        <w:tab/>
+        <w:t>Architected a company-wide design system covering tokens, color palettes, accessibility guidelines, and component specs, with compliance audits across all AI products, synced across Notion, GitHub, and code.</w:t>
       </w:r>
     </w:p>
     <w:p>
@@ -595,7 +496,42 @@
         <w:spacing w:after="14"/>
       </w:pPr>
       <w:r>
-        <w:t>Defined requirements and governance standards for a company-wide design system, including design tokens, semantic color palettes, accessibility guidelines, and component specifications, documented in a machine-readable framework synchronized across Notion, GitHub, and code.</w:t>
+        <w:t>Drove compliance from 85% to 92% via gap analyses, establishing a single source of truth adopted across all active initiatives.</w:t>
+      </w:r>
+    </w:p>
+    <w:p>
+      <w:pPr>
+        <w:tabs>
+          <w:tab w:val="right" w:pos="11057"/>
+        </w:tabs>
+        <w:spacing w:before="60"/>
+      </w:pPr>
+      <w:r>
+        <w:rPr>
+          <w:b/>
+          <w:bCs/>
+        </w:rPr>
+        <w:t>Portfolio Report Agent (Actuals vs Forecast Automation)</w:t>
+      </w:r>
+      <w:r>
+        <w:tab/>
+        <w:t>Jan 2026 – Jun 2026</w:t>
+      </w:r>
+    </w:p>
+    <w:p>
+      <w:pPr>
+        <w:tabs>
+          <w:tab w:val="right" w:pos="10224"/>
+        </w:tabs>
+        <w:spacing w:after="50"/>
+      </w:pPr>
+      <w:r>
+        <w:rPr>
+          <w:i/>
+          <w:iCs/>
+        </w:rPr>
+        <w:t>Notion Custom Agents, Projects Database, Mermaid (Gantt Roadmaps)</w:t>
+        <w:tab/>
       </w:r>
     </w:p>
     <w:p>
@@ -608,84 +544,7 @@
         <w:spacing w:after="14"/>
       </w:pPr>
       <w:r>
-        <w:t>Established compliance review processes and evidence-based audit requirements across all AI products and product prototypes, conducting gap analyses that increased design system compliance from 85% to 92% and helped create a single source of truth adopted across active product initiatives.</w:t>
-      </w:r>
-    </w:p>
-    <w:p>
-      <w:pPr>
-        <w:pBdr>
-          <w:bottom w:val="single" w:sz="6" w:space="1" w:color="000000"/>
-        </w:pBdr>
-        <w:spacing w:before="100" w:after="30"/>
-      </w:pPr>
-      <w:r>
-        <w:rPr>
-          <w:b/>
-          <w:bCs/>
-          <w:sz w:val="24"/>
-          <w:szCs w:val="24"/>
-        </w:rPr>
-        <w:t>LEADERSHIP &amp; ATHLETICS</w:t>
-      </w:r>
-    </w:p>
-    <w:p>
-      <w:pPr>
-        <w:tabs>
-          <w:tab w:val="right" w:pos="10224"/>
-        </w:tabs>
-        <w:spacing w:before="60"/>
-      </w:pPr>
-      <w:r>
-        <w:rPr>
-          <w:b/>
-          <w:bCs/>
-        </w:rPr>
-        <w:t>Northeastern Club Running (</w:t>
-      </w:r>
-      <w:proofErr w:type="gramStart"/>
-      <w:r>
-        <w:rPr>
-          <w:b/>
-          <w:bCs/>
-        </w:rPr>
-        <w:t>NUCR) —</w:t>
-      </w:r>
-      <w:proofErr w:type="gramEnd"/>
-      <w:r>
-        <w:rPr>
-          <w:b/>
-          <w:bCs/>
-        </w:rPr>
-        <w:t xml:space="preserve"> Sprinter, Track &amp; Field</w:t>
-      </w:r>
-      <w:r>
-        <w:tab/>
-      </w:r>
-      <w:r>
-        <w:t>Sept 2024 - Current</w:t>
-      </w:r>
-    </w:p>
-    <w:p>
-      <w:pPr>
-        <w:tabs>
-          <w:tab w:val="right" w:pos="10224"/>
-        </w:tabs>
-        <w:spacing w:after="50"/>
-      </w:pPr>
-      <w:r>
-        <w:rPr>
-          <w:i/>
-          <w:iCs/>
-        </w:rPr>
-        <w:t>Northeastern University Athletics</w:t>
-      </w:r>
-      <w:r>
-        <w:rPr>
-          <w:i/>
-          <w:iCs/>
-        </w:rPr>
-        <w:tab/>
-        <w:t>Boston, MA</w:t>
+        <w:t>Built a Notion custom agent automating weekly Portfolio Actuals vs Forecast reports, pulling live data from canonical project databases to generate executive-ready status reports across a 7-project portfolio.</w:t>
       </w:r>
     </w:p>
     <w:p>
@@ -698,7 +557,64 @@
         <w:spacing w:after="14"/>
       </w:pPr>
       <w:r>
-        <w:t>Compete for Northeastern University at regional, city, and state-level track and field competitions, demonstrating discipline, teamwork, and high-performance execution.</w:t>
+        <w:t>Eliminated hours of weekly manual data gathering and formatting, ensuring every data point traced to a single source with zero stale or conflicting data.</w:t>
+      </w:r>
+    </w:p>
+    <w:p>
+      <w:pPr>
+        <w:pBdr>
+          <w:bottom w:val="single" w:sz="6" w:space="1" w:color="000000"/>
+        </w:pBdr>
+        <w:spacing w:before="100" w:after="30"/>
+      </w:pPr>
+      <w:r>
+        <w:rPr>
+          <w:b/>
+          <w:bCs/>
+          <w:sz w:val="24"/>
+          <w:szCs w:val="24"/>
+        </w:rPr>
+        <w:t>LEADERSHIP &amp; ATHLETICS</w:t>
+      </w:r>
+    </w:p>
+    <w:p>
+      <w:pPr>
+        <w:tabs>
+          <w:tab w:val="right" w:pos="11057"/>
+        </w:tabs>
+        <w:spacing w:before="60"/>
+      </w:pPr>
+      <w:r>
+        <w:rPr>
+          <w:b/>
+          <w:bCs/>
+        </w:rPr>
+        <w:t>Northeastern Club Running (NUCR) - Sprinter, Track &amp; Field</w:t>
+      </w:r>
+      <w:r>
+        <w:tab/>
+        <w:t>Sept 2024 - Current</w:t>
+      </w:r>
+    </w:p>
+    <w:p>
+      <w:pPr>
+        <w:tabs>
+          <w:tab w:val="right" w:pos="11057"/>
+        </w:tabs>
+        <w:spacing w:after="50"/>
+        <w:rPr>
+          <w:i/>
+          <w:iCs/>
+        </w:rPr>
+      </w:pPr>
+      <w:r>
+        <w:rPr>
+          <w:i/>
+          <w:iCs/>
+        </w:rPr>
+        <w:t>Northeastern University Athletics</w:t>
+        <w:tab/>
+        <w:t>Boston, MA</w:t>
       </w:r>
     </w:p>
     <w:p>
@@ -711,12 +627,25 @@
         <w:spacing w:after="14"/>
       </w:pPr>
       <w:r>
+        <w:t>Compete for Northeastern University at regional, city, and state-level track and field competitions, demonstrating discipline, teamwork, and high-performance execution.</w:t>
+      </w:r>
+    </w:p>
+    <w:p>
+      <w:pPr>
+        <w:pStyle w:val="ListParagraph"/>
+        <w:numPr>
+          <w:ilvl w:val="0"/>
+          <w:numId w:val="2"/>
+        </w:numPr>
+        <w:spacing w:after="14"/>
+      </w:pPr>
+      <w:r>
         <w:t>Support university and community sporting events at Northeastern Athletics Facilities, assisting with event logistics and operations.</w:t>
       </w:r>
     </w:p>
     <w:sectPr>
       <w:pgSz w:w="12240" w:h="15840"/>
-      <w:pgMar w:top="680" w:right="737" w:bottom="680" w:left="737" w:header="709" w:footer="709" w:gutter="0"/>
+      <w:pgMar w:top="567" w:right="567" w:bottom="567" w:left="567" w:header="709" w:footer="709" w:gutter="0"/>
       <w:cols w:space="720"/>
       <w:docGrid w:linePitch="360"/>
     </w:sectPr>
@@ -886,7 +815,7 @@
   <w:docDefaults>
     <w:rPrDefault>
       <w:rPr>
-        <w:rFonts w:ascii="Arial" w:eastAsia="Arial" w:hAnsi="Arial" w:cs="Arial"/>
+        <w:rFonts w:ascii="Times New Roman" w:eastAsia="Times New Roman" w:hAnsi="Times New Roman" w:cs="Times New Roman"/>
         <w:sz w:val="21"/>
         <w:szCs w:val="21"/>
         <w:lang w:val="en-US" w:eastAsia="en-US" w:bidi="ar-SA"/>
@@ -1548,7 +1477,7 @@
     </a:clrScheme>
     <a:fontScheme name="Office">
       <a:majorFont>
-        <a:latin typeface="Aptos Display" panose="02110004020202020204"/>
+        <a:latin typeface="Times New Roman" panose="02110004020202020204"/>
         <a:ea typeface=""/>
         <a:cs typeface=""/>
         <a:font script="Jpan" typeface="游ゴシック Light"/>
@@ -1581,7 +1510,7 @@
         <a:font script="Viet" typeface="Times New Roman"/>
         <a:font script="Uigh" typeface="Microsoft Uighur"/>
         <a:font script="Geor" typeface="Sylfaen"/>
-        <a:font script="Armn" typeface="Arial"/>
+        <a:font script="Armn" typeface="Times New Roman"/>
         <a:font script="Bugi" typeface="Leelawadee UI"/>
         <a:font script="Bopo" typeface="Microsoft JhengHei"/>
         <a:font script="Java" typeface="Javanese Text"/>
@@ -1600,15 +1529,15 @@
         <a:font script="Tfng" typeface="Ebrima"/>
       </a:majorFont>
       <a:minorFont>
-        <a:latin typeface="Aptos" panose="02110004020202020204"/>
+        <a:latin typeface="Times New Roman" panose="02110004020202020204"/>
         <a:ea typeface=""/>
         <a:cs typeface=""/>
         <a:font script="Jpan" typeface="游明朝"/>
         <a:font script="Hang" typeface="맑은 고딕"/>
         <a:font script="Hans" typeface="等线"/>
         <a:font script="Hant" typeface="新細明體"/>
-        <a:font script="Arab" typeface="Arial"/>
-        <a:font script="Hebr" typeface="Arial"/>
+        <a:font script="Arab" typeface="Times New Roman"/>
+        <a:font script="Hebr" typeface="Times New Roman"/>
         <a:font script="Thai" typeface="Cordia New"/>
         <a:font script="Ethi" typeface="Nyala"/>
         <a:font script="Beng" typeface="Vrinda"/>
@@ -1630,10 +1559,10 @@
         <a:font script="Laoo" typeface="DokChampa"/>
         <a:font script="Sinh" typeface="Iskoola Pota"/>
         <a:font script="Mong" typeface="Mongolian Baiti"/>
-        <a:font script="Viet" typeface="Arial"/>
+        <a:font script="Viet" typeface="Times New Roman"/>
         <a:font script="Uigh" typeface="Microsoft Uighur"/>
         <a:font script="Geor" typeface="Sylfaen"/>
-        <a:font script="Armn" typeface="Arial"/>
+        <a:font script="Armn" typeface="Times New Roman"/>
         <a:font script="Bugi" typeface="Leelawadee UI"/>
         <a:font script="Bopo" typeface="Microsoft JhengHei"/>
         <a:font script="Java" typeface="Javanese Text"/>

</xml_diff>

<commit_message>
Make resume email a mailto hyperlink; regenerate PDF.
</commit_message>
<xml_diff>
--- a/resume/Shrey_Resume_Business_Strategy_Analyst.docx
+++ b/resume/Shrey_Resume_Business_Strategy_Analyst.docx
@@ -27,9 +27,26 @@
           <w:sz w:val="19"/>
           <w:szCs w:val="19"/>
         </w:rPr>
-        <w:t xml:space="preserve">Boston, MA  •  857-364-1539  •  shirke.sh@northeastern.edu  •  </w:t>
+        <w:t xml:space="preserve">Boston, MA  •  857-364-1539  •  </w:t>
       </w:r>
       <w:hyperlink r:id="rId5" w:history="1">
+        <w:r>
+          <w:rPr>
+            <w:rStyle w:val="Hyperlink"/>
+            <w:sz w:val="19"/>
+            <w:szCs w:val="19"/>
+          </w:rPr>
+          <w:t>shirke.sh@northeastern.edu</w:t>
+        </w:r>
+      </w:hyperlink>
+      <w:r>
+        <w:rPr>
+          <w:sz w:val="19"/>
+          <w:szCs w:val="19"/>
+        </w:rPr>
+        <w:t xml:space="preserve">  •  </w:t>
+      </w:r>
+      <w:hyperlink r:id="rId6" w:history="1">
         <w:r>
           <w:rPr>
             <w:rStyle w:val="Hyperlink"/>
@@ -46,7 +63,7 @@
         </w:rPr>
         <w:t xml:space="preserve">  •  </w:t>
       </w:r>
-      <w:hyperlink r:id="rId6" w:history="1">
+      <w:hyperlink r:id="rId7" w:history="1">
         <w:r>
           <w:rPr>
             <w:rStyle w:val="Hyperlink"/>
@@ -63,7 +80,7 @@
         </w:rPr>
         <w:t xml:space="preserve">  •  </w:t>
       </w:r>
-      <w:hyperlink r:id="rId7" w:history="1">
+      <w:hyperlink r:id="rId8" w:history="1">
         <w:r>
           <w:rPr>
             <w:rStyle w:val="Hyperlink"/>
@@ -148,6 +165,12 @@
           <w:iCs/>
         </w:rPr>
         <w:t>Northeastern University</w:t>
+      </w:r>
+      <w:r>
+        <w:rPr>
+          <w:i/>
+          <w:iCs/>
+        </w:rPr>
         <w:tab/>
         <w:t>Boston, MA</w:t>
       </w:r>
@@ -197,6 +220,12 @@
           <w:iCs/>
         </w:rPr>
         <w:t>MSG-SGKM College of Science, Arts, and Commerce, Mumbai University</w:t>
+      </w:r>
+      <w:r>
+        <w:rPr>
+          <w:i/>
+          <w:iCs/>
+        </w:rPr>
         <w:tab/>
         <w:t>Mumbai, IND</w:t>
       </w:r>
@@ -250,6 +279,12 @@
           <w:iCs/>
         </w:rPr>
         <w:t>Aosenuma.ai</w:t>
+      </w:r>
+      <w:r>
+        <w:rPr>
+          <w:i/>
+          <w:iCs/>
+        </w:rPr>
         <w:tab/>
       </w:r>
     </w:p>
@@ -470,6 +505,12 @@
           <w:iCs/>
         </w:rPr>
         <w:t>Notion, GitHub, CSS/Tokens (aosenuma.tokens.json)</w:t>
+      </w:r>
+      <w:r>
+        <w:rPr>
+          <w:i/>
+          <w:iCs/>
+        </w:rPr>
         <w:tab/>
       </w:r>
     </w:p>
@@ -531,6 +572,12 @@
           <w:iCs/>
         </w:rPr>
         <w:t>Notion Custom Agents, Projects Database, Mermaid (Gantt Roadmaps)</w:t>
+      </w:r>
+      <w:r>
+        <w:rPr>
+          <w:i/>
+          <w:iCs/>
+        </w:rPr>
         <w:tab/>
       </w:r>
     </w:p>
@@ -613,6 +660,12 @@
           <w:iCs/>
         </w:rPr>
         <w:t>Northeastern University Athletics</w:t>
+      </w:r>
+      <w:r>
+        <w:rPr>
+          <w:i/>
+          <w:iCs/>
+        </w:rPr>
         <w:tab/>
         <w:t>Boston, MA</w:t>
       </w:r>
@@ -1292,6 +1345,7 @@
   <w:style w:type="character" w:default="1" w:styleId="DefaultParagraphFont">
     <w:name w:val="Default Paragraph Font"/>
     <w:uiPriority w:val="1"/>
+    <w:semiHidden/>
     <w:unhideWhenUsed/>
   </w:style>
   <w:style w:type="table" w:default="1" w:styleId="TableNormal">

</xml_diff>

<commit_message>
Confirm metrics and sync resume with portfolio skills and bullets.
Use 18+ contributors and 2.5 hr to 20 min reporting on resume; align skills and regenerate PDF.

Co-authored-by: Cursor <cursoragent@cursor.com>
</commit_message>
<xml_diff>
--- a/resume/Shrey_Resume_Business_Strategy_Analyst.docx
+++ b/resume/Shrey_Resume_Business_Strategy_Analyst.docx
@@ -113,7 +113,13 @@
         <w:spacing w:after="50"/>
       </w:pPr>
       <w:r>
-        <w:t>Business and strategy analyst with experience supporting cross-functional initiatives across AI product development and operations. Skilled in requirements gathering (BRDs), stakeholder management, process improvement, gap analysis, and dashboard reporting, with a record of driving operational efficiency and closing measurable performance gaps. National-level sprinter and Northeastern athlete recognized for discipline, resilience, and high-performance execution in demanding environments.</w:t>
+        <w:t xml:space="preserve">Business and strategy analyst with experience supporting cross-functional initiatives across AI product development and operations. Skilled in requirements gathering (BRDs), </w:t>
+      </w:r>
+      <w:r>
+        <w:t>Stakeholder Management, Stakeholder Reporting, Process Improvement</w:t>
+      </w:r>
+      <w:r>
+        <w:t>, gap analysis, and dashboard reporting, with a record of driving operational efficiency and closing measurable performance gaps. National-level sprinter and Northeastern athlete recognized for discipline, resilience, and high-performance execution in demanding environments.</w:t>
       </w:r>
     </w:p>
     <w:p>
@@ -382,10 +388,7 @@
           <w:b/>
           <w:bCs/>
         </w:rPr>
-        <w:t>Aligned</w:t>
-      </w:r>
-      <w:r>
-        <w:t xml:space="preserve"> portfolio status through weekly PM touchpoints and cadence meetings, keeping scope and priorities in sync across the team.</w:t>
+        <w:t>Ran weekly PM touchpoints and portfolio cadence for a 7-project AI portfolio—surfacing scope drift and priority conflicts before they hit delivery.</w:t>
       </w:r>
     </w:p>
     <w:p>
@@ -403,10 +406,10 @@
           <w:b/>
           <w:bCs/>
         </w:rPr>
-        <w:t>Tracked</w:t>
-      </w:r>
-      <w:r>
-        <w:t xml:space="preserve"> team capacity and roll-offs to match resources to project demand and prevent over-allocation.  </w:t>
+        <w:t>Tracked capacity and roll-offs across 18+ contributors—rebalancing work when assignments threatened active sprint commitments.</w:t>
+      </w:r>
+      <w:r>
+        <w:t xml:space="preserve">  </w:t>
       </w:r>
     </w:p>
     <w:p>
@@ -438,7 +441,22 @@
         <w:t xml:space="preserve">Core Competencies: </w:t>
       </w:r>
       <w:r>
-        <w:t>Business Analysis, Requirements Gathering (BRDs), Stakeholder Management, Process Improvement, Strategic Planning, Gap Analysis, Root Cause Analysis, Process Mapping, Workflow Design, UAT, Dashboard Development, Data Analysis, Change Control, Sprint Planning</w:t>
+        <w:t xml:space="preserve">Business Analysis, Requirements Gathering (BRDs), </w:t>
+      </w:r>
+      <w:r>
+        <w:t>Stakeholder Management, Stakeholder Reporting, Process Improvement</w:t>
+      </w:r>
+      <w:r>
+        <w:t xml:space="preserve">, Strategic Planning, Gap Analysis, Root Cause Analysis, Process Mapping, </w:t>
+      </w:r>
+      <w:r>
+        <w:t>Workflow Design, User Stories &amp; Acceptance Criteria, UAT</w:t>
+      </w:r>
+      <w:r>
+        <w:t xml:space="preserve">, Dashboard Development, Data Analysis, </w:t>
+      </w:r>
+      <w:r>
+        <w:t>Change Control, Agile, Sprint Planning, SDLC, RACI</w:t>
       </w:r>
     </w:p>
     <w:p>
@@ -450,10 +468,7 @@
           <w:b/>
           <w:bCs/>
         </w:rPr>
-        <w:t xml:space="preserve">Tools/Platforms: </w:t>
-      </w:r>
-      <w:r>
-        <w:t>MS Excel, MS Project, Primavera, Notion, Figma, MS PowerPoint, Claude Design, Stitch</w:t>
+        <w:t>Tools/Platforms: MS Excel, MS Office, MS Project, MS PowerPoint, Primavera, Jira, Confluence, Notion, Figma, GitHub, SQL (reporting &amp; data pulls), Power BI, Claude Design, Stitch, Cursor, NotebookLM</w:t>
       </w:r>
     </w:p>
     <w:p>
@@ -524,7 +539,7 @@
         <w:spacing w:after="14"/>
       </w:pPr>
       <w:r>
-        <w:t>Architected a company-wide design system covering tokens, color palettes, accessibility guidelines, and component specs, with compliance audits across all AI products, synced across Notion, GitHub, and code.</w:t>
+        <w:t>Defined requirements for a tokenized design system (UI/UX Guidelines), synced tokens and component rules across Notion, GitHub, and code, and ran compliance audits with scorecards for leadership.</w:t>
       </w:r>
     </w:p>
     <w:p>
@@ -537,7 +552,7 @@
         <w:spacing w:after="14"/>
       </w:pPr>
       <w:r>
-        <w:t>Drove compliance from 85% to 92% via gap analyses, establishing a single source of truth adopted across all active initiatives.</w:t>
+        <w:t>Drove compliance from 85% to 92% via gap analyses; established a single source of truth adopted across 5+ active initiatives. Audited 5+ products with individual scorecards and an executive summary for leadership review.</w:t>
       </w:r>
     </w:p>
     <w:p>
@@ -591,7 +606,7 @@
         <w:spacing w:after="14"/>
       </w:pPr>
       <w:r>
-        <w:t>Built a Notion custom agent automating weekly Portfolio Actuals vs Forecast reports, pulling live data from canonical project databases to generate executive-ready status reports across a 7-project portfolio.</w:t>
+        <w:t>Configured a Notion custom agent with a weekly Monday 8:00 AM trigger, read access to canonical Projects and Tasks databases, and strict rules: reference reports define format only; live metrics always come from source databases.</w:t>
       </w:r>
     </w:p>
     <w:p>
@@ -604,7 +619,7 @@
         <w:spacing w:after="14"/>
       </w:pPr>
       <w:r>
-        <w:t>Eliminated hours of weekly manual data gathering and formatting, ensuring every data point traced to a single source with zero stale or conflicting data.</w:t>
+        <w:t>Reduced manual reporting prep from ~2.5 hours to ~20 minutes of PM review per week; every metric traces to Projects DB or Open Tasks.</w:t>
       </w:r>
     </w:p>
     <w:p>

</xml_diff>

<commit_message>
Rewrite resume summary to match portfolio positioning.
Align professional summary with co-op focus and updated stakeholder reporting language.

Co-authored-by: Cursor <cursoragent@cursor.com>
</commit_message>
<xml_diff>
--- a/resume/Shrey_Resume_Business_Strategy_Analyst.docx
+++ b/resume/Shrey_Resume_Business_Strategy_Analyst.docx
@@ -113,13 +113,13 @@
         <w:spacing w:after="50"/>
       </w:pPr>
       <w:r>
-        <w:t xml:space="preserve">Business and strategy analyst with experience supporting cross-functional initiatives across AI product development and operations. Skilled in requirements gathering (BRDs), </w:t>
-      </w:r>
-      <w:r>
-        <w:t>Stakeholder Management, Stakeholder Reporting, Process Improvement</w:t>
-      </w:r>
-      <w:r>
-        <w:t>, gap analysis, and dashboard reporting, with a record of driving operational efficiency and closing measurable performance gaps. National-level sprinter and Northeastern athlete recognized for discipline, resilience, and high-performance execution in demanding environments.</w:t>
+        <w:t>Business analyst and project operations professional supporting cross-functional AI product teams</w:t>
+      </w:r>
+      <w:r>
+        <w:t xml:space="preserve"> through requirements gathering (BRDs), stakeholder reporting, workflow design, gap analysis, and compliance audits. Co-op at Aosenuma.ai driving UI/UX governance, portfolio reporting automation, and PM cadence across a 7-project portfolio.</w:t>
+      </w:r>
+      <w:r>
+        <w:t xml:space="preserve"> National-level sprinter and Northeastern athlete recognized for discipline, resilience, and high-performance execution in demanding environments.</w:t>
       </w:r>
     </w:p>
     <w:p>

</xml_diff>

<commit_message>
Align project metrics wording across portfolio and resume.
Standardize on 5+ AI products for design audits and 7-project portfolio for reporting scope.

Co-authored-by: Cursor <cursoragent@cursor.com>
</commit_message>
<xml_diff>
--- a/resume/Shrey_Resume_Business_Strategy_Analyst.docx
+++ b/resume/Shrey_Resume_Business_Strategy_Analyst.docx
@@ -368,7 +368,14 @@
           <w:b/>
           <w:bCs/>
         </w:rPr>
-        <w:t>~80% guideline adoption across 5+ audited projects</w:t>
+        <w:t xml:space="preserve">~80% guideline adoption across </w:t>
+      </w:r>
+      <w:r>
+        <w:rPr>
+          <w:b/>
+          <w:bCs/>
+        </w:rPr>
+        <w:t>5+ audited AI products</w:t>
       </w:r>
       <w:r>
         <w:t>.</w:t>
@@ -552,7 +559,19 @@
         <w:spacing w:after="14"/>
       </w:pPr>
       <w:r>
-        <w:t>Drove compliance from 85% to 92% via gap analyses; established a single source of truth adopted across 5+ active initiatives. Audited 5+ products with individual scorecards and an executive summary for leadership review.</w:t>
+        <w:t xml:space="preserve">Drove compliance from 85% to 92% via gap analyses; established a single source of truth adopted across </w:t>
+      </w:r>
+      <w:r>
+        <w:t>5+ AI products</w:t>
+      </w:r>
+      <w:r>
+        <w:t xml:space="preserve">. Audited </w:t>
+      </w:r>
+      <w:r>
+        <w:t>5+ AI products with individual scorecards</w:t>
+      </w:r>
+      <w:r>
+        <w:t xml:space="preserve"> and an executive summary for leadership review.</w:t>
       </w:r>
     </w:p>
     <w:p>

</xml_diff>

<commit_message>
Update portfolio story: 7 projects at start, 5 active after halts.
Reflect two resource-crunch halts across site, resume, case study, and redacted sample report.

Co-authored-by: Cursor <cursoragent@cursor.com>
</commit_message>
<xml_diff>
--- a/resume/Shrey_Resume_Business_Strategy_Analyst.docx
+++ b/resume/Shrey_Resume_Business_Strategy_Analyst.docx
@@ -116,7 +116,13 @@
         <w:t>Business analyst and project operations professional supporting cross-functional AI product teams</w:t>
       </w:r>
       <w:r>
-        <w:t xml:space="preserve"> through requirements gathering (BRDs), stakeholder reporting, workflow design, gap analysis, and compliance audits. Co-op at Aosenuma.ai driving UI/UX governance, portfolio reporting automation, and PM cadence across a 7-project portfolio.</w:t>
+        <w:t xml:space="preserve"> through requirements gathering (BRDs), stakeholder reporting, workflow design, gap analysis, and compliance audits. Co-op at Aosenuma.ai driving UI/UX governance, portfolio reporting automation, and </w:t>
+      </w:r>
+      <w:r>
+        <w:t>PM cadence across 5 active projects (7 at co-op start; 2 halted for resource crunch)</w:t>
+      </w:r>
+      <w:r>
+        <w:t>.</w:t>
       </w:r>
       <w:r>
         <w:t xml:space="preserve"> National-level sprinter and Northeastern athlete recognized for discipline, resilience, and high-performance execution in demanding environments.</w:t>
@@ -375,7 +381,7 @@
           <w:b/>
           <w:bCs/>
         </w:rPr>
-        <w:t>5+ audited AI products</w:t>
+        <w:t>5 active AI products</w:t>
       </w:r>
       <w:r>
         <w:t>.</w:t>
@@ -562,13 +568,16 @@
         <w:t xml:space="preserve">Drove compliance from 85% to 92% via gap analyses; established a single source of truth adopted across </w:t>
       </w:r>
       <w:r>
-        <w:t>5+ AI products</w:t>
+        <w:t>5 active AI products</w:t>
       </w:r>
       <w:r>
         <w:t xml:space="preserve">. Audited </w:t>
       </w:r>
       <w:r>
-        <w:t>5+ AI products with individual scorecards</w:t>
+        <w:t>5 active AI products</w:t>
+      </w:r>
+      <w:r>
+        <w:t xml:space="preserve"> with individual scorecards</w:t>
       </w:r>
       <w:r>
         <w:t xml:space="preserve"> and an executive summary for leadership review.</w:t>

</xml_diff>

<commit_message>
Fix resume experience bullet punctuation for 5 active projects.
Co-authored-by: Cursor <cursoragent@cursor.com>
</commit_message>
<xml_diff>
--- a/resume/Shrey_Resume_Business_Strategy_Analyst.docx
+++ b/resume/Shrey_Resume_Business_Strategy_Analyst.docx
@@ -401,7 +401,21 @@
           <w:b/>
           <w:bCs/>
         </w:rPr>
-        <w:t>Ran weekly PM touchpoints and portfolio cadence for a 7-project AI portfolio—surfacing scope drift and priority conflicts before they hit delivery.</w:t>
+        <w:t xml:space="preserve">Ran weekly PM touchpoints and portfolio cadence for </w:t>
+      </w:r>
+      <w:r>
+        <w:rPr>
+          <w:b/>
+          <w:bCs/>
+        </w:rPr>
+        <w:t>5 active projects (7 at co-op start; 2 halted for resource crunch)</w:t>
+      </w:r>
+      <w:r>
+        <w:rPr>
+          <w:b/>
+          <w:bCs/>
+        </w:rPr>
+        <w:t>—surfacing scope drift and priority conflicts before they hit delivery.</w:t>
       </w:r>
     </w:p>
     <w:p>

</xml_diff>

<commit_message>
Separate 7 UI prototypes from 5 live company projects.
Clarify prototyping was for consistency and LLM context only; keep live portfolio halts unnamed in sample copy.

Co-authored-by: Cursor <cursoragent@cursor.com>
</commit_message>
<xml_diff>
--- a/resume/Shrey_Resume_Business_Strategy_Analyst.docx
+++ b/resume/Shrey_Resume_Business_Strategy_Analyst.docx
@@ -119,7 +119,10 @@
         <w:t xml:space="preserve"> through requirements gathering (BRDs), stakeholder reporting, workflow design, gap analysis, and compliance audits. Co-op at Aosenuma.ai driving UI/UX governance, portfolio reporting automation, and </w:t>
       </w:r>
       <w:r>
-        <w:t>PM cadence across 5 active projects (7 at co-op start; 2 halted for resource crunch)</w:t>
+        <w:t xml:space="preserve">PM cadence across </w:t>
+      </w:r>
+      <w:r>
+        <w:t>5 active live projects (7 at co-op start; 2 halted for resource crunch)</w:t>
       </w:r>
       <w:r>
         <w:t>.</w:t>
@@ -381,7 +384,7 @@
           <w:b/>
           <w:bCs/>
         </w:rPr>
-        <w:t>5 active AI products</w:t>
+        <w:t>live products (with 7 UI-only consistency prototypes for design-system validation)</w:t>
       </w:r>
       <w:r>
         <w:t>.</w:t>
@@ -408,7 +411,7 @@
           <w:b/>
           <w:bCs/>
         </w:rPr>
-        <w:t>5 active projects (7 at co-op start; 2 halted for resource crunch)</w:t>
+        <w:t>5 active live projects (7 at co-op start; 2 halted for resource crunch)</w:t>
       </w:r>
       <w:r>
         <w:rPr>
@@ -566,7 +569,7 @@
         <w:spacing w:after="14"/>
       </w:pPr>
       <w:r>
-        <w:t>Defined requirements for a tokenized design system (UI/UX Guidelines), synced tokens and component rules across Notion, GitHub, and code, and ran compliance audits with scorecards for leadership.</w:t>
+        <w:t>Defined requirements for a tokenized design system (UI/UX Guidelines), built 7 UI-only prototypes for consistency testing and LLM context, synced tokens across Notion, GitHub, and code, and ran compliance audits with scorecards for leadership.</w:t>
       </w:r>
     </w:p>
     <w:p>
@@ -582,13 +585,13 @@
         <w:t xml:space="preserve">Drove compliance from 85% to 92% via gap analyses; established a single source of truth adopted across </w:t>
       </w:r>
       <w:r>
-        <w:t>5 active AI products</w:t>
+        <w:t>live products (with 7 UI-only consistency prototypes for design-system validation)</w:t>
       </w:r>
       <w:r>
         <w:t xml:space="preserve">. Audited </w:t>
       </w:r>
       <w:r>
-        <w:t>5 active AI products</w:t>
+        <w:t>live products (with 7 UI-only consistency prototypes for design-system validation)</w:t>
       </w:r>
       <w:r>
         <w:t xml:space="preserve"> with individual scorecards</w:t>

</xml_diff>

<commit_message>
Clean up resume UI/UX project bullets after prototype split.
Co-authored-by: Cursor <cursoragent@cursor.com>
</commit_message>
<xml_diff>
--- a/resume/Shrey_Resume_Business_Strategy_Analyst.docx
+++ b/resume/Shrey_Resume_Business_Strategy_Analyst.docx
@@ -582,22 +582,13 @@
         <w:spacing w:after="14"/>
       </w:pPr>
       <w:r>
-        <w:t xml:space="preserve">Drove compliance from 85% to 92% via gap analyses; established a single source of truth adopted across </w:t>
-      </w:r>
-      <w:r>
-        <w:t>live products (with 7 UI-only consistency prototypes for design-system validation)</w:t>
-      </w:r>
-      <w:r>
-        <w:t xml:space="preserve">. Audited </w:t>
-      </w:r>
-      <w:r>
-        <w:t>live products (with 7 UI-only consistency prototypes for design-system validation)</w:t>
-      </w:r>
-      <w:r>
-        <w:t xml:space="preserve"> with individual scorecards</w:t>
-      </w:r>
-      <w:r>
-        <w:t xml:space="preserve"> and an executive summary for leadership review.</w:t>
+        <w:t>Built 7 UI-only prototypes</w:t>
+      </w:r>
+      <w:r>
+        <w:t xml:space="preserve"> for consistency testing and LLM context (separate from live portfolio). Drove compliance from 85% to 92% on live products via gap analyses; </w:t>
+      </w:r>
+      <w:r>
+        <w:t>scorecards and executive summary for leadership.</w:t>
       </w:r>
     </w:p>
     <w:p>
@@ -753,6 +744,7 @@
         <w:spacing w:after="14"/>
       </w:pPr>
       <w:r>
+        <w:lastRenderedPageBreak/>
         <w:t>Support university and community sporting events at Northeastern Athletics Facilities, assisting with event logistics and operations.</w:t>
       </w:r>
     </w:p>

</xml_diff>